<commit_message>
Update Deliverable 4 for Arabic and the language menu
Appendix C now covers the third interface language and the dropdown:
- the summary row, figures (231 tests, 3 languages) and the language
  section describe Arabic, the right-to-left layout, the language menu
  and the 14 language tests
- new screenshots: the login page with the menu open, the dashboard in
  Shona, and a new Figure 6 of the dashboard in Arabic
- the introduction note, Section 1.5, Section 7.3, Appendix B.1 and the
  cover no longer say Shona replaced the SRS's Arabic or mention the old
  EN | SN switch

Co-Authored-By: Claude Opus 5.5 <noreply@anthropic.com>
Claude-Session: https://claude.ai/code/session_01BLVAgZrQBMgC6fgji1xmot
</commit_message>
<xml_diff>
--- a/docs/ABDURRAHMAAN_IT401_DEL_4.docx
+++ b/docs/ABDURRAHMAAN_IT401_DEL_4.docx
@@ -545,7 +545,7 @@
                 <w:sz w:val="18"/>
                 <w:szCs w:val="18"/>
               </w:rPr>
-              <w:t xml:space="preserve">Appendix A — Installation Guide · Appendix B — User Manual</w:t>
+              <w:t xml:space="preserve">Appendix A — Installation Guide · Appendix B — User Manual · Appendix C — System Updates Since Deliverable 5</w:t>
             </w:r>
           </w:p>
         </w:tc>
@@ -675,7 +675,7 @@
           <w:sz w:val="21"/>
           <w:szCs w:val="21"/>
         </w:rPr>
-        <w:t xml:space="preserve">Note: this report describes RentalPro as it stood at Deliverable 5. Appendix C summarises everything added since — the billing engine, a property map, a redesigned interface, an English/Shona language switch and Harare demonstration data — with the current figures (18 tables, 226 tests, 82% coverage).</w:t>
+        <w:t xml:space="preserve">Note: this report describes RentalPro as it stood at Deliverable 5. Appendix C summarises everything added since — the billing engine, a property map, a redesigned interface, English, Shona and Arabic interface languages chosen from a language menu (with a right-to-left layout for Arabic), and Harare demonstration data — with the current figures (18 tables, 231 tests, 82% coverage).</w:t>
       </w:r>
     </w:p>
     <w:p>
@@ -1407,7 +1407,7 @@
           <w:sz w:val="21"/>
           <w:szCs w:val="21"/>
         </w:rPr>
-        <w:t xml:space="preserve">Multi-currency support described in the SRS is represented in the data model (currency per property). Of the multi-language support it described (Arabic/English), a translated interface was later implemented as English/Shona instead, to suit the system’s Harare users (Appendix C).</w:t>
+        <w:t xml:space="preserve">Multi-currency support described in the SRS is represented in the data model (currency per property). The multi-language support it described (Arabic/English) was later implemented as a translated interface in English, Shona and Arabic, with Shona added for the system’s Harare users (Appendix C).</w:t>
       </w:r>
     </w:p>
     <w:p>
@@ -25869,7 +25869,7 @@
           <w:sz w:val="21"/>
           <w:szCs w:val="21"/>
         </w:rPr>
-        <w:t xml:space="preserve">The system is single-currency-per-property. Its interface is now available in English and Shona (Appendix C), but only the main screens are translated so far.</w:t>
+        <w:t xml:space="preserve">The system is single-currency-per-property. Its interface is now available in English, Shona and Arabic (Appendix C), but only the main screens are translated so far.</w:t>
       </w:r>
     </w:p>
     <w:p>
@@ -28198,7 +28198,7 @@
           <w:sz w:val="21"/>
           <w:szCs w:val="21"/>
         </w:rPr>
-        <w:t xml:space="preserve">Open the application in a browser and sign in at the login page with the email and password given to you by your property owner or manager (or one of the demo accounts in Appendix A.5, for evaluation). Every screen after login shows a navigation bar across the top, scoped to your role — you will only ever see navigation links for actions you are permitted to perform. The EN | SN switch at the top right changes the interface language between English and Shona.</w:t>
+        <w:t xml:space="preserve">Open the application in a browser and sign in at the login page with the email and password given to you by your property owner or manager (or one of the demo accounts in Appendix A.5, for evaluation). Every screen after login shows a navigation bar across the top, scoped to your role — you will only ever see navigation links for actions you are permitted to perform. The language button at the top right (top left in Arabic) opens a list of English, ChiShona and Arabic; choosing Arabic also turns the page right to left.</w:t>
       </w:r>
     </w:p>
     <w:p>
@@ -30127,7 +30127,7 @@
           <w:sz w:val="21"/>
           <w:szCs w:val="21"/>
         </w:rPr>
-        <w:t xml:space="preserve">This section brings the document up to date. The rest of the document describes RentalPro as it stood at Deliverable 5, and its figures are deliberately left as they were at that time. Since then the system has gained a billing engine, a property map, a redesigned interface, an English/Shona language switch and Harare demonstration data. Each change was made additively, behind the existing test suite, with new tests of its own.</w:t>
+        <w:t xml:space="preserve">This section brings the document up to date. The rest of the document describes RentalPro as it stood at Deliverable 5, and its figures are deliberately left as they were at that time. Since then the system has gained a billing engine, a property map, a redesigned interface, English, Shona and Arabic interface languages and Harare demonstration data. Each change was made additively, behind the existing test suite, with new tests of its own.</w:t>
       </w:r>
     </w:p>
     <w:p>
@@ -30497,7 +30497,7 @@
                 <w:sz w:val="18"/>
                 <w:szCs w:val="18"/>
               </w:rPr>
-              <w:t xml:space="preserve">English / Shona</w:t>
+              <w:t xml:space="preserve">Languages</w:t>
             </w:r>
           </w:p>
         </w:tc>
@@ -30522,7 +30522,7 @@
                 <w:sz w:val="18"/>
                 <w:szCs w:val="18"/>
               </w:rPr>
-              <w:t xml:space="preserve">An EN | SN switch in the top bar and on the login page; a small translator (backend/i18n.py) with an English fallback; the choice survives logging in and out. Names and places are never translated.</w:t>
+              <w:t xml:space="preserve">A language menu in the top bar and on the login page shows the current language and opens a list of English, ChiShona and Arabic; a small translator (backend/i18n.py) with an English fallback; Arabic pages switch to a right-to-left layout; the choice survives logging in and out. Names and places are never translated.</w:t>
             </w:r>
           </w:p>
         </w:tc>
@@ -30547,7 +30547,7 @@
                 <w:sz w:val="18"/>
                 <w:szCs w:val="18"/>
               </w:rPr>
-              <w:t xml:space="preserve">9</w:t>
+              <w:t xml:space="preserve">14</w:t>
             </w:r>
           </w:p>
         </w:tc>
@@ -31360,7 +31360,7 @@
                 <w:sz w:val="18"/>
                 <w:szCs w:val="18"/>
               </w:rPr>
-              <w:t xml:space="preserve">226</w:t>
+              <w:t xml:space="preserve">231</w:t>
             </w:r>
           </w:p>
         </w:tc>
@@ -31514,7 +31514,7 @@
                 <w:sz w:val="18"/>
                 <w:szCs w:val="18"/>
               </w:rPr>
-              <w:t xml:space="preserve">2 (English, Shona)</w:t>
+              <w:t xml:space="preserve">3 (English, Shona, Arabic)</w:t>
             </w:r>
           </w:p>
         </w:tc>
@@ -31536,7 +31536,7 @@
           <w:sz w:val="21"/>
           <w:szCs w:val="21"/>
         </w:rPr>
-        <w:t xml:space="preserve">All 226 tests pass with no failures, and the suite still runs entirely offline, with no paid external account needed.</w:t>
+        <w:t xml:space="preserve">All 231 tests pass with no failures, and the suite still runs entirely offline, with no paid external account needed.</w:t>
       </w:r>
     </w:p>
     <w:p>
@@ -31567,7 +31567,7 @@
           <w:sz w:val="21"/>
           <w:szCs w:val="21"/>
         </w:rPr>
-        <w:t xml:space="preserve">The SRS described multi-language support as Arabic and English. Because RentalPro's intended users are landlords, managers and tenants in Harare, Shona — the most widely spoken language there — was implemented as the second language instead. The design is language-neutral, so adding another language, Arabic included, only needs another phrase table.</w:t>
+        <w:t xml:space="preserve">The SRS described multi-language support as Arabic and English. Both are now implemented, together with Shona. Shona, the most widely spoken language in Harare, serves the landlords, managers and tenants the system was built for; Arabic, the second language the SRS named, serves Arabic-speaking residents and property owners in Zimbabwe. Each language is only another phrase table, so a further language, such as Ndebele, can be added the same way.</w:t>
       </w:r>
     </w:p>
     <w:p>
@@ -31595,7 +31595,7 @@
           <w:sz w:val="21"/>
           <w:szCs w:val="21"/>
         </w:rPr>
-        <w:t xml:space="preserve">Templates wrap interface text in _("…"); backend/i18n.py looks each phrase up in a Shona table and falls back to English for anything not yet translated, so the app works at every stage of translation.</w:t>
+        <w:t xml:space="preserve">Templates wrap interface text in _("…"); backend/i18n.py looks each phrase up in the table for the chosen language (the Shona and Arabic tables hold the same 98 phrases) and falls back to English for anything not yet translated, so the app works at every stage of translation.</w:t>
       </w:r>
     </w:p>
     <w:p>
@@ -31615,7 +31615,7 @@
           <w:sz w:val="21"/>
           <w:szCs w:val="21"/>
         </w:rPr>
-        <w:t xml:space="preserve">Switching: </w:t>
+        <w:t xml:space="preserve">Right-to-left layout: </w:t>
       </w:r>
       <w:r>
         <w:rPr>
@@ -31623,7 +31623,35 @@
           <w:sz w:val="21"/>
           <w:szCs w:val="21"/>
         </w:rPr>
-        <w:t xml:space="preserve">An EN | SN switch in the top bar and on the login page stores the choice in the session; it survives logging in and out, and the switch's return address is checked so it cannot redirect off-site.</w:t>
+        <w:t xml:space="preserve">Arabic is written from right to left, so an Arabic page is marked dir="rtl" and the browser mirrors the layout: the navigation starts from the right and table columns read from right to left (Figure 6), and on the login page the RentalPro name and the language menu swap corners. The stylesheet aligns text to the start of the line rather than to a fixed left or right, so one stylesheet serves both directions. English and Shona stay left to right.</w:t>
+      </w:r>
+    </w:p>
+    <w:p>
+      <w:pPr>
+        <w:pStyle w:val="ListParagraph"/>
+        <w:numPr>
+          <w:ilvl w:val="0"/>
+          <w:numId w:val="2"/>
+        </w:numPr>
+        <w:spacing w:after="90"/>
+      </w:pPr>
+      <w:r>
+        <w:rPr>
+          <w:b/>
+          <w:bCs/>
+          <w:color w:val="1E293B"/>
+          <w:sz w:val="21"/>
+          <w:szCs w:val="21"/>
+        </w:rPr>
+        <w:t xml:space="preserve">Choosing a language: </w:t>
+      </w:r>
+      <w:r>
+        <w:rPr>
+          <w:color w:val="1E293B"/>
+          <w:sz w:val="21"/>
+          <w:szCs w:val="21"/>
+        </w:rPr>
+        <w:t xml:space="preserve">A language button in the top bar and on the login page shows the current language; clicking its arrow opens a vertical list of English, ChiShona and Arabic, each written in its own language (Figures 4 and 6). The list closes on a click elsewhere or the Escape key. The choice is stored in the session and survives logging in and out, and the menu’s return address is checked so it cannot redirect off-site.</w:t>
       </w:r>
     </w:p>
     <w:p>
@@ -31679,7 +31707,35 @@
           <w:sz w:val="21"/>
           <w:szCs w:val="21"/>
         </w:rPr>
-        <w:t xml:space="preserve">Property names, addresses, suburbs, cities and people's names are data, not interface text, and read the same in both languages; a test fails if a Harare place name is ever altered or given a Shona entry.</w:t>
+        <w:t xml:space="preserve">Property names, addresses, suburbs, cities and people’s names are data, not interface text, and read the same in every language; a test fails if a Harare place name is altered in Shona or Arabic, or given an entry in either phrase table.</w:t>
+      </w:r>
+    </w:p>
+    <w:p>
+      <w:pPr>
+        <w:pStyle w:val="ListParagraph"/>
+        <w:numPr>
+          <w:ilvl w:val="0"/>
+          <w:numId w:val="2"/>
+        </w:numPr>
+        <w:spacing w:after="90"/>
+      </w:pPr>
+      <w:r>
+        <w:rPr>
+          <w:b/>
+          <w:bCs/>
+          <w:color w:val="1E293B"/>
+          <w:sz w:val="21"/>
+          <w:szCs w:val="21"/>
+        </w:rPr>
+        <w:t xml:space="preserve">Tests: </w:t>
+      </w:r>
+      <w:r>
+        <w:rPr>
+          <w:color w:val="1E293B"/>
+          <w:sz w:val="21"/>
+          <w:szCs w:val="21"/>
+        </w:rPr>
+        <w:t xml:space="preserve">Fourteen tests cover the languages: switching to Shona and to Arabic, the right-to-left direction for Arabic only, the choice surviving login, the tenant portal in Shona and in Arabic, the language menu, unknown language codes, off-site redirects, placeholders kept in every translation, Arabic covering every Shona phrase, and place names.</w:t>
       </w:r>
     </w:p>
     <w:p>
@@ -31707,7 +31763,7 @@
           <w:sz w:val="21"/>
           <w:szCs w:val="21"/>
         </w:rPr>
-        <w:t xml:space="preserve">The Shona wording has not yet been reviewed by a native speaker.</w:t>
+        <w:t xml:space="preserve">The Shona and Arabic wording has not yet been reviewed by native speakers.</w:t>
       </w:r>
     </w:p>
     <w:p>
@@ -31738,7 +31794,7 @@
           <wp:inline distT="0" distB="0" distL="0" distR="0">
             <wp:extent cx="5943600" cy="3714750"/>
             <wp:effectExtent t="0" r="0" b="0" l="0"/>
-            <wp:docPr id="900" name="Picture 900" descr="RentalPro login page over a photograph of the Harare skyline, with an EN | SN switch"/>
+            <wp:docPr id="900" name="Picture 900" descr="RentalPro login page over a photograph of the Harare skyline, with the language menu opened"/>
             <wp:cNvGraphicFramePr>
               <a:graphicFrameLocks xmlns:a="http://schemas.openxmlformats.org/drawingml/2006/main" noChangeAspect="1"/>
             </wp:cNvGraphicFramePr>
@@ -31746,7 +31802,7 @@
               <a:graphicData uri="http://schemas.openxmlformats.org/drawingml/2006/picture">
                 <pic:pic xmlns:pic="http://schemas.openxmlformats.org/drawingml/2006/picture">
                   <pic:nvPicPr>
-                    <pic:cNvPr id="900" name="Picture 900" descr="RentalPro login page over a photograph of the Harare skyline, with an EN | SN switch"/>
+                    <pic:cNvPr id="900" name="Picture 900" descr="RentalPro login page over a photograph of the Harare skyline, with the language menu opened"/>
                     <pic:cNvPicPr>
                       <a:picLocks noChangeAspect="1"/>
                     </pic:cNvPicPr>
@@ -31791,7 +31847,7 @@
           <w:sz w:val="18"/>
           <w:szCs w:val="18"/>
         </w:rPr>
-        <w:t xml:space="preserve">Figure 4: The login page — Harare skyline, translucent card, EN | SN switch</w:t>
+        <w:t xml:space="preserve">Figure 4: The login page — Harare skyline, translucent card and the language menu, opened</w:t>
       </w:r>
     </w:p>
     <w:p>
@@ -31863,6 +31919,73 @@
     </w:p>
     <w:p>
       <w:pPr>
+        <w:keepNext/>
+        <w:spacing w:after="0" w:before="160"/>
+        <w:jc w:val="center"/>
+      </w:pPr>
+      <w:r>
+        <w:drawing>
+          <wp:inline distT="0" distB="0" distL="0" distR="0">
+            <wp:extent cx="5943600" cy="3714750"/>
+            <wp:effectExtent t="0" r="0" b="0" l="0"/>
+            <wp:docPr id="902" name="Picture 902" descr="The portfolio dashboard shown in Arabic, right to left, with the language menu open"/>
+            <wp:cNvGraphicFramePr>
+              <a:graphicFrameLocks xmlns:a="http://schemas.openxmlformats.org/drawingml/2006/main" noChangeAspect="1"/>
+            </wp:cNvGraphicFramePr>
+            <a:graphic xmlns:a="http://schemas.openxmlformats.org/drawingml/2006/main">
+              <a:graphicData uri="http://schemas.openxmlformats.org/drawingml/2006/picture">
+                <pic:pic xmlns:pic="http://schemas.openxmlformats.org/drawingml/2006/picture">
+                  <pic:nvPicPr>
+                    <pic:cNvPr id="902" name="Picture 902" descr="The portfolio dashboard shown in Arabic, right to left, with the language menu open"/>
+                    <pic:cNvPicPr>
+                      <a:picLocks noChangeAspect="1"/>
+                    </pic:cNvPicPr>
+                  </pic:nvPicPr>
+                  <pic:blipFill>
+                    <a:blip r:embed="rId902"/>
+                    <a:stretch>
+                      <a:fillRect/>
+                    </a:stretch>
+                  </pic:blipFill>
+                  <pic:spPr>
+                    <a:xfrm>
+                      <a:off x="0" y="0"/>
+                      <a:ext cx="5943600" cy="3714750"/>
+                    </a:xfrm>
+                    <a:prstGeom prst="rect">
+                      <a:avLst/>
+                    </a:prstGeom>
+                    <a:ln w="9525">
+                      <a:solidFill>
+                        <a:srgbClr val="CBD5E1"/>
+                      </a:solidFill>
+                    </a:ln>
+                  </pic:spPr>
+                </pic:pic>
+              </a:graphicData>
+            </a:graphic>
+          </wp:inline>
+        </w:drawing>
+      </w:r>
+    </w:p>
+    <w:p>
+      <w:pPr>
+        <w:spacing w:after="260" w:before="80"/>
+        <w:jc w:val="center"/>
+      </w:pPr>
+      <w:r>
+        <w:rPr>
+          <w:i/>
+          <w:iCs/>
+          <w:color w:val="64748B"/>
+          <w:sz w:val="18"/>
+          <w:szCs w:val="18"/>
+        </w:rPr>
+        <w:t xml:space="preserve">Figure 6: The portfolio dashboard in Arabic — the layout reads right to left and the language menu is open</w:t>
+      </w:r>
+    </w:p>
+    <w:p>
+      <w:pPr>
         <w:spacing w:after="180" w:line="276"/>
         <w:jc w:val="both"/>
       </w:pPr>
@@ -31872,7 +31995,7 @@
           <w:sz w:val="21"/>
           <w:szCs w:val="21"/>
         </w:rPr>
-        <w:t xml:space="preserve">Using the language switch (addition to Appendix B): click EN or SN at the top right of any page, or of the login page, to change the interface language. The choice stays in place until you change it again.</w:t>
+        <w:t xml:space="preserve">Choosing a language (addition to Appendix B): click the language button at the top right of any page or of the login page (top left when the page is in Arabic), then pick English, ChiShona or Arabic from the list. The choice stays in place until you change it again.</w:t>
       </w:r>
     </w:p>
     <w:p>

</xml_diff>

<commit_message>
Final pre-submission fixes to the Deliverable 4 report
- The cover and Section 1.6 list Appendix C alongside A and B.
- "As submitted for Deliverable 4" now reads "as it stood at
  Deliverable 4", since this is the document being submitted.
- Appendix C adds the Render deployment (render.yaml, proxy-aware
  HTTPS and client address, one scheduler across Gunicorn workers) and
  today's figures: 305 tests, 86% coverage.
- A short administrator note (Manage Users, Add Staff) joins the
  language note as an addition to the user manual.
- Heading styles carry outline levels and the table of contents field
  holds a filled-in result, so it shows in any viewer; Word can still
  refresh it. All 103 entries were checked against the rendered pages.
- The PDF is re-exported from the updated document (47 pages).

D3 is unchanged.

Co-Authored-By: Claude Opus 5.5 <noreply@anthropic.com>
Claude-Session: https://claude.ai/code/session_01Ae7GFufZcC1fFQLcjKeCLN
</commit_message>
<xml_diff>
--- a/docs/ABDURRAHMAAN_IT401_DEL_4.docx
+++ b/docs/ABDURRAHMAAN_IT401_DEL_4.docx
@@ -545,7 +545,7 @@
                 <w:sz w:val="18"/>
                 <w:szCs w:val="18"/>
               </w:rPr>
-              <w:t xml:space="preserve">Appendix A — Installation Guide · Appendix B — User Manual</w:t>
+              <w:t>Appendix A — Installation Guide · Appendix B — User Manual · Appendix C — Updates Since Deliverable 4</w:t>
             </w:r>
           </w:p>
         </w:tc>
@@ -627,10 +627,2849 @@
       </w:sdtPr>
       <w:sdtContent>
         <w:p>
+          <w:pPr>
+            <w:tabs>
+              <w:tab w:val="right" w:leader="dot" w:pos="10070"/>
+            </w:tabs>
+            <w:spacing w:before="120" w:after="20"/>
+            <w:ind w:left="0"/>
+          </w:pPr>
           <w:r>
             <w:fldChar w:fldCharType="begin" w:dirty="true"/>
             <w:instrText xml:space="preserve">TOC \h \o "1-3"</w:instrText>
             <w:fldChar w:fldCharType="separate"/>
+          </w:r>
+          <w:r>
+            <w:rPr>
+              <w:b/>
+              <w:bCs/>
+              <w:color w:val="0F172A"/>
+            </w:rPr>
+            <w:t xml:space="preserve">Chapter 1: Introduction</w:t>
+          </w:r>
+          <w:r>
+            <w:rPr>
+              <w:b/>
+              <w:bCs/>
+              <w:color w:val="0F172A"/>
+            </w:rPr>
+            <w:tab/>
+          </w:r>
+          <w:r>
+            <w:rPr>
+              <w:b/>
+              <w:bCs/>
+              <w:color w:val="0F172A"/>
+            </w:rPr>
+            <w:t>5</w:t>
+          </w:r>
+        </w:p>
+        <w:p>
+          <w:pPr>
+            <w:tabs>
+              <w:tab w:val="right" w:leader="dot" w:pos="10070"/>
+            </w:tabs>
+            <w:spacing w:before="0" w:after="20"/>
+            <w:ind w:left="240"/>
+          </w:pPr>
+          <w:r>
+            <w:rPr>
+              <w:color w:val="0F172A"/>
+            </w:rPr>
+            <w:t xml:space="preserve">1.1 Background</w:t>
+          </w:r>
+          <w:r>
+            <w:rPr>
+              <w:color w:val="0F172A"/>
+            </w:rPr>
+            <w:tab/>
+          </w:r>
+          <w:r>
+            <w:rPr>
+              <w:color w:val="0F172A"/>
+            </w:rPr>
+            <w:t>5</w:t>
+          </w:r>
+        </w:p>
+        <w:p>
+          <w:pPr>
+            <w:tabs>
+              <w:tab w:val="right" w:leader="dot" w:pos="10070"/>
+            </w:tabs>
+            <w:spacing w:before="0" w:after="20"/>
+            <w:ind w:left="240"/>
+          </w:pPr>
+          <w:r>
+            <w:rPr>
+              <w:color w:val="0F172A"/>
+            </w:rPr>
+            <w:t xml:space="preserve">1.2 Problem Statement</w:t>
+          </w:r>
+          <w:r>
+            <w:rPr>
+              <w:color w:val="0F172A"/>
+            </w:rPr>
+            <w:tab/>
+          </w:r>
+          <w:r>
+            <w:rPr>
+              <w:color w:val="0F172A"/>
+            </w:rPr>
+            <w:t>5</w:t>
+          </w:r>
+        </w:p>
+        <w:p>
+          <w:pPr>
+            <w:tabs>
+              <w:tab w:val="right" w:leader="dot" w:pos="10070"/>
+            </w:tabs>
+            <w:spacing w:before="0" w:after="20"/>
+            <w:ind w:left="240"/>
+          </w:pPr>
+          <w:r>
+            <w:rPr>
+              <w:color w:val="0F172A"/>
+            </w:rPr>
+            <w:t xml:space="preserve">1.3 Objectives</w:t>
+          </w:r>
+          <w:r>
+            <w:rPr>
+              <w:color w:val="0F172A"/>
+            </w:rPr>
+            <w:tab/>
+          </w:r>
+          <w:r>
+            <w:rPr>
+              <w:color w:val="0F172A"/>
+            </w:rPr>
+            <w:t>5</w:t>
+          </w:r>
+        </w:p>
+        <w:p>
+          <w:pPr>
+            <w:tabs>
+              <w:tab w:val="right" w:leader="dot" w:pos="10070"/>
+            </w:tabs>
+            <w:spacing w:before="0" w:after="20"/>
+            <w:ind w:left="240"/>
+          </w:pPr>
+          <w:r>
+            <w:rPr>
+              <w:color w:val="0F172A"/>
+            </w:rPr>
+            <w:t xml:space="preserve">1.4 Scope</w:t>
+          </w:r>
+          <w:r>
+            <w:rPr>
+              <w:color w:val="0F172A"/>
+            </w:rPr>
+            <w:tab/>
+          </w:r>
+          <w:r>
+            <w:rPr>
+              <w:color w:val="0F172A"/>
+            </w:rPr>
+            <w:t>6</w:t>
+          </w:r>
+        </w:p>
+        <w:p>
+          <w:pPr>
+            <w:tabs>
+              <w:tab w:val="right" w:leader="dot" w:pos="10070"/>
+            </w:tabs>
+            <w:spacing w:before="0" w:after="20"/>
+            <w:ind w:left="240"/>
+          </w:pPr>
+          <w:r>
+            <w:rPr>
+              <w:color w:val="0F172A"/>
+            </w:rPr>
+            <w:t xml:space="preserve">1.5 Limitations</w:t>
+          </w:r>
+          <w:r>
+            <w:rPr>
+              <w:color w:val="0F172A"/>
+            </w:rPr>
+            <w:tab/>
+          </w:r>
+          <w:r>
+            <w:rPr>
+              <w:color w:val="0F172A"/>
+            </w:rPr>
+            <w:t>6</w:t>
+          </w:r>
+        </w:p>
+        <w:p>
+          <w:pPr>
+            <w:tabs>
+              <w:tab w:val="right" w:leader="dot" w:pos="10070"/>
+            </w:tabs>
+            <w:spacing w:before="0" w:after="20"/>
+            <w:ind w:left="240"/>
+          </w:pPr>
+          <w:r>
+            <w:rPr>
+              <w:color w:val="0F172A"/>
+            </w:rPr>
+            <w:t xml:space="preserve">1.6 Project Overview</w:t>
+          </w:r>
+          <w:r>
+            <w:rPr>
+              <w:color w:val="0F172A"/>
+            </w:rPr>
+            <w:tab/>
+          </w:r>
+          <w:r>
+            <w:rPr>
+              <w:color w:val="0F172A"/>
+            </w:rPr>
+            <w:t>6</w:t>
+          </w:r>
+        </w:p>
+        <w:p>
+          <w:pPr>
+            <w:tabs>
+              <w:tab w:val="right" w:leader="dot" w:pos="10070"/>
+            </w:tabs>
+            <w:spacing w:before="120" w:after="20"/>
+            <w:ind w:left="0"/>
+          </w:pPr>
+          <w:r>
+            <w:rPr>
+              <w:b/>
+              <w:bCs/>
+              <w:color w:val="0F172A"/>
+            </w:rPr>
+            <w:t xml:space="preserve">Chapter 2: Object-Oriented Analysis</w:t>
+          </w:r>
+          <w:r>
+            <w:rPr>
+              <w:b/>
+              <w:bCs/>
+              <w:color w:val="0F172A"/>
+            </w:rPr>
+            <w:tab/>
+          </w:r>
+          <w:r>
+            <w:rPr>
+              <w:b/>
+              <w:bCs/>
+              <w:color w:val="0F172A"/>
+            </w:rPr>
+            <w:t>8</w:t>
+          </w:r>
+        </w:p>
+        <w:p>
+          <w:pPr>
+            <w:tabs>
+              <w:tab w:val="right" w:leader="dot" w:pos="10070"/>
+            </w:tabs>
+            <w:spacing w:before="0" w:after="20"/>
+            <w:ind w:left="240"/>
+          </w:pPr>
+          <w:r>
+            <w:rPr>
+              <w:color w:val="0F172A"/>
+            </w:rPr>
+            <w:t xml:space="preserve">2.1 Overview</w:t>
+          </w:r>
+          <w:r>
+            <w:rPr>
+              <w:color w:val="0F172A"/>
+            </w:rPr>
+            <w:tab/>
+          </w:r>
+          <w:r>
+            <w:rPr>
+              <w:color w:val="0F172A"/>
+            </w:rPr>
+            <w:t>8</w:t>
+          </w:r>
+        </w:p>
+        <w:p>
+          <w:pPr>
+            <w:tabs>
+              <w:tab w:val="right" w:leader="dot" w:pos="10070"/>
+            </w:tabs>
+            <w:spacing w:before="0" w:after="20"/>
+            <w:ind w:left="240"/>
+          </w:pPr>
+          <w:r>
+            <w:rPr>
+              <w:color w:val="0F172A"/>
+            </w:rPr>
+            <w:t xml:space="preserve">2.2 System Actors</w:t>
+          </w:r>
+          <w:r>
+            <w:rPr>
+              <w:color w:val="0F172A"/>
+            </w:rPr>
+            <w:tab/>
+          </w:r>
+          <w:r>
+            <w:rPr>
+              <w:color w:val="0F172A"/>
+            </w:rPr>
+            <w:t>8</w:t>
+          </w:r>
+        </w:p>
+        <w:p>
+          <w:pPr>
+            <w:tabs>
+              <w:tab w:val="right" w:leader="dot" w:pos="10070"/>
+            </w:tabs>
+            <w:spacing w:before="0" w:after="20"/>
+            <w:ind w:left="240"/>
+          </w:pPr>
+          <w:r>
+            <w:rPr>
+              <w:color w:val="0F172A"/>
+            </w:rPr>
+            <w:t xml:space="preserve">2.3 Use Case Model</w:t>
+          </w:r>
+          <w:r>
+            <w:rPr>
+              <w:color w:val="0F172A"/>
+            </w:rPr>
+            <w:tab/>
+          </w:r>
+          <w:r>
+            <w:rPr>
+              <w:color w:val="0F172A"/>
+            </w:rPr>
+            <w:t>8</w:t>
+          </w:r>
+        </w:p>
+        <w:p>
+          <w:pPr>
+            <w:tabs>
+              <w:tab w:val="right" w:leader="dot" w:pos="10070"/>
+            </w:tabs>
+            <w:spacing w:before="0" w:after="20"/>
+            <w:ind w:left="480"/>
+          </w:pPr>
+          <w:r>
+            <w:rPr>
+              <w:color w:val="0F172A"/>
+            </w:rPr>
+            <w:t xml:space="preserve">2.3.1 Detailed Use Case — UC-09: Upload Lease Document</w:t>
+          </w:r>
+          <w:r>
+            <w:rPr>
+              <w:color w:val="0F172A"/>
+            </w:rPr>
+            <w:tab/>
+          </w:r>
+          <w:r>
+            <w:rPr>
+              <w:color w:val="0F172A"/>
+            </w:rPr>
+            <w:t>9</w:t>
+          </w:r>
+        </w:p>
+        <w:p>
+          <w:pPr>
+            <w:tabs>
+              <w:tab w:val="right" w:leader="dot" w:pos="10070"/>
+            </w:tabs>
+            <w:spacing w:before="0" w:after="20"/>
+            <w:ind w:left="480"/>
+          </w:pPr>
+          <w:r>
+            <w:rPr>
+              <w:color w:val="0F172A"/>
+            </w:rPr>
+            <w:t xml:space="preserve">2.3.2 Detailed Use Case — UC-13: Pay Rent Online</w:t>
+          </w:r>
+          <w:r>
+            <w:rPr>
+              <w:color w:val="0F172A"/>
+            </w:rPr>
+            <w:tab/>
+          </w:r>
+          <w:r>
+            <w:rPr>
+              <w:color w:val="0F172A"/>
+            </w:rPr>
+            <w:t>10</w:t>
+          </w:r>
+        </w:p>
+        <w:p>
+          <w:pPr>
+            <w:tabs>
+              <w:tab w:val="right" w:leader="dot" w:pos="10070"/>
+            </w:tabs>
+            <w:spacing w:before="0" w:after="20"/>
+            <w:ind w:left="480"/>
+          </w:pPr>
+          <w:r>
+            <w:rPr>
+              <w:color w:val="0F172A"/>
+            </w:rPr>
+            <w:t xml:space="preserve">2.3.3 Detailed Use Case — UC-18/UC-19/UC-20/UC-21: Maintenance Request Lifecycle</w:t>
+          </w:r>
+          <w:r>
+            <w:rPr>
+              <w:color w:val="0F172A"/>
+            </w:rPr>
+            <w:tab/>
+          </w:r>
+          <w:r>
+            <w:rPr>
+              <w:color w:val="0F172A"/>
+            </w:rPr>
+            <w:t>11</w:t>
+          </w:r>
+        </w:p>
+        <w:p>
+          <w:pPr>
+            <w:tabs>
+              <w:tab w:val="right" w:leader="dot" w:pos="10070"/>
+            </w:tabs>
+            <w:spacing w:before="0" w:after="20"/>
+            <w:ind w:left="240"/>
+          </w:pPr>
+          <w:r>
+            <w:rPr>
+              <w:color w:val="0F172A"/>
+            </w:rPr>
+            <w:t xml:space="preserve">2.4 Non-Functional Requirements Analysis</w:t>
+          </w:r>
+          <w:r>
+            <w:rPr>
+              <w:color w:val="0F172A"/>
+            </w:rPr>
+            <w:tab/>
+          </w:r>
+          <w:r>
+            <w:rPr>
+              <w:color w:val="0F172A"/>
+            </w:rPr>
+            <w:t>11</w:t>
+          </w:r>
+        </w:p>
+        <w:p>
+          <w:pPr>
+            <w:tabs>
+              <w:tab w:val="right" w:leader="dot" w:pos="10070"/>
+            </w:tabs>
+            <w:spacing w:before="0" w:after="20"/>
+            <w:ind w:left="240"/>
+          </w:pPr>
+          <w:r>
+            <w:rPr>
+              <w:color w:val="0F172A"/>
+            </w:rPr>
+            <w:t xml:space="preserve">2.5 Domain (Conceptual Class) Analysis</w:t>
+          </w:r>
+          <w:r>
+            <w:rPr>
+              <w:color w:val="0F172A"/>
+            </w:rPr>
+            <w:tab/>
+          </w:r>
+          <w:r>
+            <w:rPr>
+              <w:color w:val="0F172A"/>
+            </w:rPr>
+            <w:t>12</w:t>
+          </w:r>
+        </w:p>
+        <w:p>
+          <w:pPr>
+            <w:tabs>
+              <w:tab w:val="right" w:leader="dot" w:pos="10070"/>
+            </w:tabs>
+            <w:spacing w:before="120" w:after="20"/>
+            <w:ind w:left="0"/>
+          </w:pPr>
+          <w:r>
+            <w:rPr>
+              <w:b/>
+              <w:bCs/>
+              <w:color w:val="0F172A"/>
+            </w:rPr>
+            <w:t xml:space="preserve">Chapter 3: Object-Oriented Design</w:t>
+          </w:r>
+          <w:r>
+            <w:rPr>
+              <w:b/>
+              <w:bCs/>
+              <w:color w:val="0F172A"/>
+            </w:rPr>
+            <w:tab/>
+          </w:r>
+          <w:r>
+            <w:rPr>
+              <w:b/>
+              <w:bCs/>
+              <w:color w:val="0F172A"/>
+            </w:rPr>
+            <w:t>13</w:t>
+          </w:r>
+        </w:p>
+        <w:p>
+          <w:pPr>
+            <w:tabs>
+              <w:tab w:val="right" w:leader="dot" w:pos="10070"/>
+            </w:tabs>
+            <w:spacing w:before="0" w:after="20"/>
+            <w:ind w:left="240"/>
+          </w:pPr>
+          <w:r>
+            <w:rPr>
+              <w:color w:val="0F172A"/>
+            </w:rPr>
+            <w:t xml:space="preserve">3.1 Architectural Style</w:t>
+          </w:r>
+          <w:r>
+            <w:rPr>
+              <w:color w:val="0F172A"/>
+            </w:rPr>
+            <w:tab/>
+          </w:r>
+          <w:r>
+            <w:rPr>
+              <w:color w:val="0F172A"/>
+            </w:rPr>
+            <w:t>13</w:t>
+          </w:r>
+        </w:p>
+        <w:p>
+          <w:pPr>
+            <w:tabs>
+              <w:tab w:val="right" w:leader="dot" w:pos="10070"/>
+            </w:tabs>
+            <w:spacing w:before="0" w:after="20"/>
+            <w:ind w:left="240"/>
+          </w:pPr>
+          <w:r>
+            <w:rPr>
+              <w:color w:val="0F172A"/>
+            </w:rPr>
+            <w:t xml:space="preserve">3.2 Design Patterns Used</w:t>
+          </w:r>
+          <w:r>
+            <w:rPr>
+              <w:color w:val="0F172A"/>
+            </w:rPr>
+            <w:tab/>
+          </w:r>
+          <w:r>
+            <w:rPr>
+              <w:color w:val="0F172A"/>
+            </w:rPr>
+            <w:t>13</w:t>
+          </w:r>
+        </w:p>
+        <w:p>
+          <w:pPr>
+            <w:tabs>
+              <w:tab w:val="right" w:leader="dot" w:pos="10070"/>
+            </w:tabs>
+            <w:spacing w:before="0" w:after="20"/>
+            <w:ind w:left="240"/>
+          </w:pPr>
+          <w:r>
+            <w:rPr>
+              <w:color w:val="0F172A"/>
+            </w:rPr>
+            <w:t xml:space="preserve">3.3 Package Structure</w:t>
+          </w:r>
+          <w:r>
+            <w:rPr>
+              <w:color w:val="0F172A"/>
+            </w:rPr>
+            <w:tab/>
+          </w:r>
+          <w:r>
+            <w:rPr>
+              <w:color w:val="0F172A"/>
+            </w:rPr>
+            <w:t>14</w:t>
+          </w:r>
+        </w:p>
+        <w:p>
+          <w:pPr>
+            <w:tabs>
+              <w:tab w:val="right" w:leader="dot" w:pos="10070"/>
+            </w:tabs>
+            <w:spacing w:before="0" w:after="20"/>
+            <w:ind w:left="240"/>
+          </w:pPr>
+          <w:r>
+            <w:rPr>
+              <w:color w:val="0F172A"/>
+            </w:rPr>
+            <w:t xml:space="preserve">3.4 Class Diagram</w:t>
+          </w:r>
+          <w:r>
+            <w:rPr>
+              <w:color w:val="0F172A"/>
+            </w:rPr>
+            <w:tab/>
+          </w:r>
+          <w:r>
+            <w:rPr>
+              <w:color w:val="0F172A"/>
+            </w:rPr>
+            <w:t>15</w:t>
+          </w:r>
+        </w:p>
+        <w:p>
+          <w:pPr>
+            <w:tabs>
+              <w:tab w:val="right" w:leader="dot" w:pos="10070"/>
+            </w:tabs>
+            <w:spacing w:before="0" w:after="20"/>
+            <w:ind w:left="480"/>
+          </w:pPr>
+          <w:r>
+            <w:rPr>
+              <w:color w:val="0F172A"/>
+            </w:rPr>
+            <w:t xml:space="preserve">3.4.1 Class Relationships and Multiplicity</w:t>
+          </w:r>
+          <w:r>
+            <w:rPr>
+              <w:color w:val="0F172A"/>
+            </w:rPr>
+            <w:tab/>
+          </w:r>
+          <w:r>
+            <w:rPr>
+              <w:color w:val="0F172A"/>
+            </w:rPr>
+            <w:t>15</w:t>
+          </w:r>
+        </w:p>
+        <w:p>
+          <w:pPr>
+            <w:tabs>
+              <w:tab w:val="right" w:leader="dot" w:pos="10070"/>
+            </w:tabs>
+            <w:spacing w:before="0" w:after="20"/>
+            <w:ind w:left="240"/>
+          </w:pPr>
+          <w:r>
+            <w:rPr>
+              <w:color w:val="0F172A"/>
+            </w:rPr>
+            <w:t xml:space="preserve">3.5 Interaction Design — Sequence of Key Operations</w:t>
+          </w:r>
+          <w:r>
+            <w:rPr>
+              <w:color w:val="0F172A"/>
+            </w:rPr>
+            <w:tab/>
+          </w:r>
+          <w:r>
+            <w:rPr>
+              <w:color w:val="0F172A"/>
+            </w:rPr>
+            <w:t>16</w:t>
+          </w:r>
+        </w:p>
+        <w:p>
+          <w:pPr>
+            <w:tabs>
+              <w:tab w:val="right" w:leader="dot" w:pos="10070"/>
+            </w:tabs>
+            <w:spacing w:before="0" w:after="20"/>
+            <w:ind w:left="480"/>
+          </w:pPr>
+          <w:r>
+            <w:rPr>
+              <w:color w:val="0F172A"/>
+            </w:rPr>
+            <w:t xml:space="preserve">3.5.1 Sequence — Pay Rent Online (UC-13)</w:t>
+          </w:r>
+          <w:r>
+            <w:rPr>
+              <w:color w:val="0F172A"/>
+            </w:rPr>
+            <w:tab/>
+          </w:r>
+          <w:r>
+            <w:rPr>
+              <w:color w:val="0F172A"/>
+            </w:rPr>
+            <w:t>16</w:t>
+          </w:r>
+        </w:p>
+        <w:p>
+          <w:pPr>
+            <w:tabs>
+              <w:tab w:val="right" w:leader="dot" w:pos="10070"/>
+            </w:tabs>
+            <w:spacing w:before="0" w:after="20"/>
+            <w:ind w:left="480"/>
+          </w:pPr>
+          <w:r>
+            <w:rPr>
+              <w:color w:val="0F172A"/>
+            </w:rPr>
+            <w:t xml:space="preserve">3.5.2 Sequence — Submit &amp; Assign Maintenance Request (UC-18 &amp; UC-19)</w:t>
+          </w:r>
+          <w:r>
+            <w:rPr>
+              <w:color w:val="0F172A"/>
+            </w:rPr>
+            <w:tab/>
+          </w:r>
+          <w:r>
+            <w:rPr>
+              <w:color w:val="0F172A"/>
+            </w:rPr>
+            <w:t>17</w:t>
+          </w:r>
+        </w:p>
+        <w:p>
+          <w:pPr>
+            <w:tabs>
+              <w:tab w:val="right" w:leader="dot" w:pos="10070"/>
+            </w:tabs>
+            <w:spacing w:before="0" w:after="20"/>
+            <w:ind w:left="240"/>
+          </w:pPr>
+          <w:r>
+            <w:rPr>
+              <w:color w:val="0F172A"/>
+            </w:rPr>
+            <w:t xml:space="preserve">3.6 Activity Design — Maintenance Request Lifecycle</w:t>
+          </w:r>
+          <w:r>
+            <w:rPr>
+              <w:color w:val="0F172A"/>
+            </w:rPr>
+            <w:tab/>
+          </w:r>
+          <w:r>
+            <w:rPr>
+              <w:color w:val="0F172A"/>
+            </w:rPr>
+            <w:t>17</w:t>
+          </w:r>
+        </w:p>
+        <w:p>
+          <w:pPr>
+            <w:tabs>
+              <w:tab w:val="right" w:leader="dot" w:pos="10070"/>
+            </w:tabs>
+            <w:spacing w:before="0" w:after="20"/>
+            <w:ind w:left="240"/>
+          </w:pPr>
+          <w:r>
+            <w:rPr>
+              <w:color w:val="0F172A"/>
+            </w:rPr>
+            <w:t xml:space="preserve">3.7 Design Decisions and Rationale</w:t>
+          </w:r>
+          <w:r>
+            <w:rPr>
+              <w:color w:val="0F172A"/>
+            </w:rPr>
+            <w:tab/>
+          </w:r>
+          <w:r>
+            <w:rPr>
+              <w:color w:val="0F172A"/>
+            </w:rPr>
+            <w:t>18</w:t>
+          </w:r>
+        </w:p>
+        <w:p>
+          <w:pPr>
+            <w:tabs>
+              <w:tab w:val="right" w:leader="dot" w:pos="10070"/>
+            </w:tabs>
+            <w:spacing w:before="120" w:after="20"/>
+            <w:ind w:left="0"/>
+          </w:pPr>
+          <w:r>
+            <w:rPr>
+              <w:b/>
+              <w:bCs/>
+              <w:color w:val="0F172A"/>
+            </w:rPr>
+            <w:t xml:space="preserve">Chapter 4: Database Design</w:t>
+          </w:r>
+          <w:r>
+            <w:rPr>
+              <w:b/>
+              <w:bCs/>
+              <w:color w:val="0F172A"/>
+            </w:rPr>
+            <w:tab/>
+          </w:r>
+          <w:r>
+            <w:rPr>
+              <w:b/>
+              <w:bCs/>
+              <w:color w:val="0F172A"/>
+            </w:rPr>
+            <w:t>19</w:t>
+          </w:r>
+        </w:p>
+        <w:p>
+          <w:pPr>
+            <w:tabs>
+              <w:tab w:val="right" w:leader="dot" w:pos="10070"/>
+            </w:tabs>
+            <w:spacing w:before="0" w:after="20"/>
+            <w:ind w:left="240"/>
+          </w:pPr>
+          <w:r>
+            <w:rPr>
+              <w:color w:val="0F172A"/>
+            </w:rPr>
+            <w:t xml:space="preserve">4.1 Database Technology</w:t>
+          </w:r>
+          <w:r>
+            <w:rPr>
+              <w:color w:val="0F172A"/>
+            </w:rPr>
+            <w:tab/>
+          </w:r>
+          <w:r>
+            <w:rPr>
+              <w:color w:val="0F172A"/>
+            </w:rPr>
+            <w:t>19</w:t>
+          </w:r>
+        </w:p>
+        <w:p>
+          <w:pPr>
+            <w:tabs>
+              <w:tab w:val="right" w:leader="dot" w:pos="10070"/>
+            </w:tabs>
+            <w:spacing w:before="0" w:after="20"/>
+            <w:ind w:left="240"/>
+          </w:pPr>
+          <w:r>
+            <w:rPr>
+              <w:color w:val="0F172A"/>
+            </w:rPr>
+            <w:t xml:space="preserve">4.2 Entity Relationship Diagram</w:t>
+          </w:r>
+          <w:r>
+            <w:rPr>
+              <w:color w:val="0F172A"/>
+            </w:rPr>
+            <w:tab/>
+          </w:r>
+          <w:r>
+            <w:rPr>
+              <w:color w:val="0F172A"/>
+            </w:rPr>
+            <w:t>19</w:t>
+          </w:r>
+        </w:p>
+        <w:p>
+          <w:pPr>
+            <w:tabs>
+              <w:tab w:val="right" w:leader="dot" w:pos="10070"/>
+            </w:tabs>
+            <w:spacing w:before="0" w:after="20"/>
+            <w:ind w:left="240"/>
+          </w:pPr>
+          <w:r>
+            <w:rPr>
+              <w:color w:val="0F172A"/>
+            </w:rPr>
+            <w:t xml:space="preserve">4.3 Schema Design Decisions</w:t>
+          </w:r>
+          <w:r>
+            <w:rPr>
+              <w:color w:val="0F172A"/>
+            </w:rPr>
+            <w:tab/>
+          </w:r>
+          <w:r>
+            <w:rPr>
+              <w:color w:val="0F172A"/>
+            </w:rPr>
+            <w:t>19</w:t>
+          </w:r>
+        </w:p>
+        <w:p>
+          <w:pPr>
+            <w:tabs>
+              <w:tab w:val="right" w:leader="dot" w:pos="10070"/>
+            </w:tabs>
+            <w:spacing w:before="0" w:after="20"/>
+            <w:ind w:left="240"/>
+          </w:pPr>
+          <w:r>
+            <w:rPr>
+              <w:color w:val="0F172A"/>
+            </w:rPr>
+            <w:t xml:space="preserve">4.4 Entity Summary and Cardinalities</w:t>
+          </w:r>
+          <w:r>
+            <w:rPr>
+              <w:color w:val="0F172A"/>
+            </w:rPr>
+            <w:tab/>
+          </w:r>
+          <w:r>
+            <w:rPr>
+              <w:color w:val="0F172A"/>
+            </w:rPr>
+            <w:t>20</w:t>
+          </w:r>
+        </w:p>
+        <w:p>
+          <w:pPr>
+            <w:tabs>
+              <w:tab w:val="right" w:leader="dot" w:pos="10070"/>
+            </w:tabs>
+            <w:spacing w:before="0" w:after="20"/>
+            <w:ind w:left="240"/>
+          </w:pPr>
+          <w:r>
+            <w:rPr>
+              <w:color w:val="0F172A"/>
+            </w:rPr>
+            <w:t xml:space="preserve">4.5 Table Definitions</w:t>
+          </w:r>
+          <w:r>
+            <w:rPr>
+              <w:color w:val="0F172A"/>
+            </w:rPr>
+            <w:tab/>
+          </w:r>
+          <w:r>
+            <w:rPr>
+              <w:color w:val="0F172A"/>
+            </w:rPr>
+            <w:t>21</w:t>
+          </w:r>
+        </w:p>
+        <w:p>
+          <w:pPr>
+            <w:tabs>
+              <w:tab w:val="right" w:leader="dot" w:pos="10070"/>
+            </w:tabs>
+            <w:spacing w:before="0" w:after="20"/>
+            <w:ind w:left="480"/>
+          </w:pPr>
+          <w:r>
+            <w:rPr>
+              <w:color w:val="0F172A"/>
+            </w:rPr>
+            <w:t xml:space="preserve">4.5.1 users</w:t>
+          </w:r>
+          <w:r>
+            <w:rPr>
+              <w:color w:val="0F172A"/>
+            </w:rPr>
+            <w:tab/>
+          </w:r>
+          <w:r>
+            <w:rPr>
+              <w:color w:val="0F172A"/>
+            </w:rPr>
+            <w:t>21</w:t>
+          </w:r>
+        </w:p>
+        <w:p>
+          <w:pPr>
+            <w:tabs>
+              <w:tab w:val="right" w:leader="dot" w:pos="10070"/>
+            </w:tabs>
+            <w:spacing w:before="0" w:after="20"/>
+            <w:ind w:left="480"/>
+          </w:pPr>
+          <w:r>
+            <w:rPr>
+              <w:color w:val="0F172A"/>
+            </w:rPr>
+            <w:t xml:space="preserve">4.5.2 properties</w:t>
+          </w:r>
+          <w:r>
+            <w:rPr>
+              <w:color w:val="0F172A"/>
+            </w:rPr>
+            <w:tab/>
+          </w:r>
+          <w:r>
+            <w:rPr>
+              <w:color w:val="0F172A"/>
+            </w:rPr>
+            <w:t>21</w:t>
+          </w:r>
+        </w:p>
+        <w:p>
+          <w:pPr>
+            <w:tabs>
+              <w:tab w:val="right" w:leader="dot" w:pos="10070"/>
+            </w:tabs>
+            <w:spacing w:before="0" w:after="20"/>
+            <w:ind w:left="480"/>
+          </w:pPr>
+          <w:r>
+            <w:rPr>
+              <w:color w:val="0F172A"/>
+            </w:rPr>
+            <w:t xml:space="preserve">4.5.3 units</w:t>
+          </w:r>
+          <w:r>
+            <w:rPr>
+              <w:color w:val="0F172A"/>
+            </w:rPr>
+            <w:tab/>
+          </w:r>
+          <w:r>
+            <w:rPr>
+              <w:color w:val="0F172A"/>
+            </w:rPr>
+            <w:t>22</w:t>
+          </w:r>
+        </w:p>
+        <w:p>
+          <w:pPr>
+            <w:tabs>
+              <w:tab w:val="right" w:leader="dot" w:pos="10070"/>
+            </w:tabs>
+            <w:spacing w:before="0" w:after="20"/>
+            <w:ind w:left="480"/>
+          </w:pPr>
+          <w:r>
+            <w:rPr>
+              <w:color w:val="0F172A"/>
+            </w:rPr>
+            <w:t xml:space="preserve">4.5.4 tenants</w:t>
+          </w:r>
+          <w:r>
+            <w:rPr>
+              <w:color w:val="0F172A"/>
+            </w:rPr>
+            <w:tab/>
+          </w:r>
+          <w:r>
+            <w:rPr>
+              <w:color w:val="0F172A"/>
+            </w:rPr>
+            <w:t>22</w:t>
+          </w:r>
+        </w:p>
+        <w:p>
+          <w:pPr>
+            <w:tabs>
+              <w:tab w:val="right" w:leader="dot" w:pos="10070"/>
+            </w:tabs>
+            <w:spacing w:before="0" w:after="20"/>
+            <w:ind w:left="480"/>
+          </w:pPr>
+          <w:r>
+            <w:rPr>
+              <w:color w:val="0F172A"/>
+            </w:rPr>
+            <w:t xml:space="preserve">4.5.5 leases</w:t>
+          </w:r>
+          <w:r>
+            <w:rPr>
+              <w:color w:val="0F172A"/>
+            </w:rPr>
+            <w:tab/>
+          </w:r>
+          <w:r>
+            <w:rPr>
+              <w:color w:val="0F172A"/>
+            </w:rPr>
+            <w:t>22</w:t>
+          </w:r>
+        </w:p>
+        <w:p>
+          <w:pPr>
+            <w:tabs>
+              <w:tab w:val="right" w:leader="dot" w:pos="10070"/>
+            </w:tabs>
+            <w:spacing w:before="0" w:after="20"/>
+            <w:ind w:left="480"/>
+          </w:pPr>
+          <w:r>
+            <w:rPr>
+              <w:color w:val="0F172A"/>
+            </w:rPr>
+            <w:t xml:space="preserve">4.5.6 rent_payments, maintenance_requests, and remaining tables</w:t>
+          </w:r>
+          <w:r>
+            <w:rPr>
+              <w:color w:val="0F172A"/>
+            </w:rPr>
+            <w:tab/>
+          </w:r>
+          <w:r>
+            <w:rPr>
+              <w:color w:val="0F172A"/>
+            </w:rPr>
+            <w:t>23</w:t>
+          </w:r>
+        </w:p>
+        <w:p>
+          <w:pPr>
+            <w:tabs>
+              <w:tab w:val="right" w:leader="dot" w:pos="10070"/>
+            </w:tabs>
+            <w:spacing w:before="0" w:after="20"/>
+            <w:ind w:left="240"/>
+          </w:pPr>
+          <w:r>
+            <w:rPr>
+              <w:color w:val="0F172A"/>
+            </w:rPr>
+            <w:t xml:space="preserve">4.6 Indexes</w:t>
+          </w:r>
+          <w:r>
+            <w:rPr>
+              <w:color w:val="0F172A"/>
+            </w:rPr>
+            <w:tab/>
+          </w:r>
+          <w:r>
+            <w:rPr>
+              <w:color w:val="0F172A"/>
+            </w:rPr>
+            <w:t>23</w:t>
+          </w:r>
+        </w:p>
+        <w:p>
+          <w:pPr>
+            <w:tabs>
+              <w:tab w:val="right" w:leader="dot" w:pos="10070"/>
+            </w:tabs>
+            <w:spacing w:before="0" w:after="20"/>
+            <w:ind w:left="240"/>
+          </w:pPr>
+          <w:r>
+            <w:rPr>
+              <w:color w:val="0F172A"/>
+            </w:rPr>
+            <w:t xml:space="preserve">4.7 Referential Integrity</w:t>
+          </w:r>
+          <w:r>
+            <w:rPr>
+              <w:color w:val="0F172A"/>
+            </w:rPr>
+            <w:tab/>
+          </w:r>
+          <w:r>
+            <w:rPr>
+              <w:color w:val="0F172A"/>
+            </w:rPr>
+            <w:t>23</w:t>
+          </w:r>
+        </w:p>
+        <w:p>
+          <w:pPr>
+            <w:tabs>
+              <w:tab w:val="right" w:leader="dot" w:pos="10070"/>
+            </w:tabs>
+            <w:spacing w:before="120" w:after="20"/>
+            <w:ind w:left="0"/>
+          </w:pPr>
+          <w:r>
+            <w:rPr>
+              <w:b/>
+              <w:bCs/>
+              <w:color w:val="0F172A"/>
+            </w:rPr>
+            <w:t xml:space="preserve">Chapter 5: Software Development</w:t>
+          </w:r>
+          <w:r>
+            <w:rPr>
+              <w:b/>
+              <w:bCs/>
+              <w:color w:val="0F172A"/>
+            </w:rPr>
+            <w:tab/>
+          </w:r>
+          <w:r>
+            <w:rPr>
+              <w:b/>
+              <w:bCs/>
+              <w:color w:val="0F172A"/>
+            </w:rPr>
+            <w:t>25</w:t>
+          </w:r>
+        </w:p>
+        <w:p>
+          <w:pPr>
+            <w:tabs>
+              <w:tab w:val="right" w:leader="dot" w:pos="10070"/>
+            </w:tabs>
+            <w:spacing w:before="0" w:after="20"/>
+            <w:ind w:left="240"/>
+          </w:pPr>
+          <w:r>
+            <w:rPr>
+              <w:color w:val="0F172A"/>
+            </w:rPr>
+            <w:t xml:space="preserve">5.1 Technology Stack</w:t>
+          </w:r>
+          <w:r>
+            <w:rPr>
+              <w:color w:val="0F172A"/>
+            </w:rPr>
+            <w:tab/>
+          </w:r>
+          <w:r>
+            <w:rPr>
+              <w:color w:val="0F172A"/>
+            </w:rPr>
+            <w:t>25</w:t>
+          </w:r>
+        </w:p>
+        <w:p>
+          <w:pPr>
+            <w:tabs>
+              <w:tab w:val="right" w:leader="dot" w:pos="10070"/>
+            </w:tabs>
+            <w:spacing w:before="0" w:after="20"/>
+            <w:ind w:left="240"/>
+          </w:pPr>
+          <w:r>
+            <w:rPr>
+              <w:color w:val="0F172A"/>
+            </w:rPr>
+            <w:t xml:space="preserve">5.2 Development Methodology</w:t>
+          </w:r>
+          <w:r>
+            <w:rPr>
+              <w:color w:val="0F172A"/>
+            </w:rPr>
+            <w:tab/>
+          </w:r>
+          <w:r>
+            <w:rPr>
+              <w:color w:val="0F172A"/>
+            </w:rPr>
+            <w:t>25</w:t>
+          </w:r>
+        </w:p>
+        <w:p>
+          <w:pPr>
+            <w:tabs>
+              <w:tab w:val="right" w:leader="dot" w:pos="10070"/>
+            </w:tabs>
+            <w:spacing w:before="0" w:after="20"/>
+            <w:ind w:left="240"/>
+          </w:pPr>
+          <w:r>
+            <w:rPr>
+              <w:color w:val="0F172A"/>
+            </w:rPr>
+            <w:t xml:space="preserve">5.3 Application Factory and Configuration</w:t>
+          </w:r>
+          <w:r>
+            <w:rPr>
+              <w:color w:val="0F172A"/>
+            </w:rPr>
+            <w:tab/>
+          </w:r>
+          <w:r>
+            <w:rPr>
+              <w:color w:val="0F172A"/>
+            </w:rPr>
+            <w:t>25</w:t>
+          </w:r>
+        </w:p>
+        <w:p>
+          <w:pPr>
+            <w:tabs>
+              <w:tab w:val="right" w:leader="dot" w:pos="10070"/>
+            </w:tabs>
+            <w:spacing w:before="0" w:after="20"/>
+            <w:ind w:left="240"/>
+          </w:pPr>
+          <w:r>
+            <w:rPr>
+              <w:color w:val="0F172A"/>
+            </w:rPr>
+            <w:t xml:space="preserve">5.4 Route-to-Use-Case Mapping</w:t>
+          </w:r>
+          <w:r>
+            <w:rPr>
+              <w:color w:val="0F172A"/>
+            </w:rPr>
+            <w:tab/>
+          </w:r>
+          <w:r>
+            <w:rPr>
+              <w:color w:val="0F172A"/>
+            </w:rPr>
+            <w:t>26</w:t>
+          </w:r>
+        </w:p>
+        <w:p>
+          <w:pPr>
+            <w:tabs>
+              <w:tab w:val="right" w:leader="dot" w:pos="10070"/>
+            </w:tabs>
+            <w:spacing w:before="0" w:after="20"/>
+            <w:ind w:left="240"/>
+          </w:pPr>
+          <w:r>
+            <w:rPr>
+              <w:color w:val="0F172A"/>
+            </w:rPr>
+            <w:t xml:space="preserve">5.5 Key Algorithms</w:t>
+          </w:r>
+          <w:r>
+            <w:rPr>
+              <w:color w:val="0F172A"/>
+            </w:rPr>
+            <w:tab/>
+          </w:r>
+          <w:r>
+            <w:rPr>
+              <w:color w:val="0F172A"/>
+            </w:rPr>
+            <w:t>27</w:t>
+          </w:r>
+        </w:p>
+        <w:p>
+          <w:pPr>
+            <w:tabs>
+              <w:tab w:val="right" w:leader="dot" w:pos="10070"/>
+            </w:tabs>
+            <w:spacing w:before="0" w:after="20"/>
+            <w:ind w:left="480"/>
+          </w:pPr>
+          <w:r>
+            <w:rPr>
+              <w:color w:val="0F172A"/>
+            </w:rPr>
+            <w:t xml:space="preserve">5.5.1 Recurring Rent Due-Date Calculation</w:t>
+          </w:r>
+          <w:r>
+            <w:rPr>
+              <w:color w:val="0F172A"/>
+            </w:rPr>
+            <w:tab/>
+          </w:r>
+          <w:r>
+            <w:rPr>
+              <w:color w:val="0F172A"/>
+            </w:rPr>
+            <w:t>27</w:t>
+          </w:r>
+        </w:p>
+        <w:p>
+          <w:pPr>
+            <w:tabs>
+              <w:tab w:val="right" w:leader="dot" w:pos="10070"/>
+            </w:tabs>
+            <w:spacing w:before="0" w:after="20"/>
+            <w:ind w:left="480"/>
+          </w:pPr>
+          <w:r>
+            <w:rPr>
+              <w:color w:val="0F172A"/>
+            </w:rPr>
+            <w:t xml:space="preserve">5.5.2 Role-Based Access Control and IDOR Protection</w:t>
+          </w:r>
+          <w:r>
+            <w:rPr>
+              <w:color w:val="0F172A"/>
+            </w:rPr>
+            <w:tab/>
+          </w:r>
+          <w:r>
+            <w:rPr>
+              <w:color w:val="0F172A"/>
+            </w:rPr>
+            <w:t>27</w:t>
+          </w:r>
+        </w:p>
+        <w:p>
+          <w:pPr>
+            <w:tabs>
+              <w:tab w:val="right" w:leader="dot" w:pos="10070"/>
+            </w:tabs>
+            <w:spacing w:before="0" w:after="20"/>
+            <w:ind w:left="480"/>
+          </w:pPr>
+          <w:r>
+            <w:rPr>
+              <w:color w:val="0F172A"/>
+            </w:rPr>
+            <w:t xml:space="preserve">5.5.3 Idempotent Numbering and Payment Recording</w:t>
+          </w:r>
+          <w:r>
+            <w:rPr>
+              <w:color w:val="0F172A"/>
+            </w:rPr>
+            <w:tab/>
+          </w:r>
+          <w:r>
+            <w:rPr>
+              <w:color w:val="0F172A"/>
+            </w:rPr>
+            <w:t>28</w:t>
+          </w:r>
+        </w:p>
+        <w:p>
+          <w:pPr>
+            <w:tabs>
+              <w:tab w:val="right" w:leader="dot" w:pos="10070"/>
+            </w:tabs>
+            <w:spacing w:before="0" w:after="20"/>
+            <w:ind w:left="480"/>
+          </w:pPr>
+          <w:r>
+            <w:rPr>
+              <w:color w:val="0F172A"/>
+            </w:rPr>
+            <w:t xml:space="preserve">5.5.4 Dev-Mode Fallback for External Services</w:t>
+          </w:r>
+          <w:r>
+            <w:rPr>
+              <w:color w:val="0F172A"/>
+            </w:rPr>
+            <w:tab/>
+          </w:r>
+          <w:r>
+            <w:rPr>
+              <w:color w:val="0F172A"/>
+            </w:rPr>
+            <w:t>28</w:t>
+          </w:r>
+        </w:p>
+        <w:p>
+          <w:pPr>
+            <w:tabs>
+              <w:tab w:val="right" w:leader="dot" w:pos="10070"/>
+            </w:tabs>
+            <w:spacing w:before="0" w:after="20"/>
+            <w:ind w:left="240"/>
+          </w:pPr>
+          <w:r>
+            <w:rPr>
+              <w:color w:val="0F172A"/>
+            </w:rPr>
+            <w:t xml:space="preserve">5.6 Security Implementation</w:t>
+          </w:r>
+          <w:r>
+            <w:rPr>
+              <w:color w:val="0F172A"/>
+            </w:rPr>
+            <w:tab/>
+          </w:r>
+          <w:r>
+            <w:rPr>
+              <w:color w:val="0F172A"/>
+            </w:rPr>
+            <w:t>28</w:t>
+          </w:r>
+        </w:p>
+        <w:p>
+          <w:pPr>
+            <w:tabs>
+              <w:tab w:val="right" w:leader="dot" w:pos="10070"/>
+            </w:tabs>
+            <w:spacing w:before="0" w:after="20"/>
+            <w:ind w:left="240"/>
+          </w:pPr>
+          <w:r>
+            <w:rPr>
+              <w:color w:val="0F172A"/>
+            </w:rPr>
+            <w:t xml:space="preserve">5.7 Deployment</w:t>
+          </w:r>
+          <w:r>
+            <w:rPr>
+              <w:color w:val="0F172A"/>
+            </w:rPr>
+            <w:tab/>
+          </w:r>
+          <w:r>
+            <w:rPr>
+              <w:color w:val="0F172A"/>
+            </w:rPr>
+            <w:t>29</w:t>
+          </w:r>
+        </w:p>
+        <w:p>
+          <w:pPr>
+            <w:tabs>
+              <w:tab w:val="right" w:leader="dot" w:pos="10070"/>
+            </w:tabs>
+            <w:spacing w:before="0" w:after="20"/>
+            <w:ind w:left="480"/>
+          </w:pPr>
+          <w:r>
+            <w:rPr>
+              <w:color w:val="0F172A"/>
+            </w:rPr>
+            <w:t xml:space="preserve">5.7.1 Docker</w:t>
+          </w:r>
+          <w:r>
+            <w:rPr>
+              <w:color w:val="0F172A"/>
+            </w:rPr>
+            <w:tab/>
+          </w:r>
+          <w:r>
+            <w:rPr>
+              <w:color w:val="0F172A"/>
+            </w:rPr>
+            <w:t>29</w:t>
+          </w:r>
+        </w:p>
+        <w:p>
+          <w:pPr>
+            <w:tabs>
+              <w:tab w:val="right" w:leader="dot" w:pos="10070"/>
+            </w:tabs>
+            <w:spacing w:before="0" w:after="20"/>
+            <w:ind w:left="480"/>
+          </w:pPr>
+          <w:r>
+            <w:rPr>
+              <w:color w:val="0F172A"/>
+            </w:rPr>
+            <w:t xml:space="preserve">5.7.2 Continuous Integration</w:t>
+          </w:r>
+          <w:r>
+            <w:rPr>
+              <w:color w:val="0F172A"/>
+            </w:rPr>
+            <w:tab/>
+          </w:r>
+          <w:r>
+            <w:rPr>
+              <w:color w:val="0F172A"/>
+            </w:rPr>
+            <w:t>29</w:t>
+          </w:r>
+        </w:p>
+        <w:p>
+          <w:pPr>
+            <w:tabs>
+              <w:tab w:val="right" w:leader="dot" w:pos="10070"/>
+            </w:tabs>
+            <w:spacing w:before="0" w:after="20"/>
+            <w:ind w:left="240"/>
+          </w:pPr>
+          <w:r>
+            <w:rPr>
+              <w:color w:val="0F172A"/>
+            </w:rPr>
+            <w:t xml:space="preserve">5.8 Implementation Defects Found and Fixed</w:t>
+          </w:r>
+          <w:r>
+            <w:rPr>
+              <w:color w:val="0F172A"/>
+            </w:rPr>
+            <w:tab/>
+          </w:r>
+          <w:r>
+            <w:rPr>
+              <w:color w:val="0F172A"/>
+            </w:rPr>
+            <w:t>29</w:t>
+          </w:r>
+        </w:p>
+        <w:p>
+          <w:pPr>
+            <w:tabs>
+              <w:tab w:val="right" w:leader="dot" w:pos="10070"/>
+            </w:tabs>
+            <w:spacing w:before="120" w:after="20"/>
+            <w:ind w:left="0"/>
+          </w:pPr>
+          <w:r>
+            <w:rPr>
+              <w:b/>
+              <w:bCs/>
+              <w:color w:val="0F172A"/>
+            </w:rPr>
+            <w:t xml:space="preserve">Chapter 6: Testing</w:t>
+          </w:r>
+          <w:r>
+            <w:rPr>
+              <w:b/>
+              <w:bCs/>
+              <w:color w:val="0F172A"/>
+            </w:rPr>
+            <w:tab/>
+          </w:r>
+          <w:r>
+            <w:rPr>
+              <w:b/>
+              <w:bCs/>
+              <w:color w:val="0F172A"/>
+            </w:rPr>
+            <w:t>31</w:t>
+          </w:r>
+        </w:p>
+        <w:p>
+          <w:pPr>
+            <w:tabs>
+              <w:tab w:val="right" w:leader="dot" w:pos="10070"/>
+            </w:tabs>
+            <w:spacing w:before="0" w:after="20"/>
+            <w:ind w:left="240"/>
+          </w:pPr>
+          <w:r>
+            <w:rPr>
+              <w:color w:val="0F172A"/>
+            </w:rPr>
+            <w:t xml:space="preserve">6.1 Testing Strategy</w:t>
+          </w:r>
+          <w:r>
+            <w:rPr>
+              <w:color w:val="0F172A"/>
+            </w:rPr>
+            <w:tab/>
+          </w:r>
+          <w:r>
+            <w:rPr>
+              <w:color w:val="0F172A"/>
+            </w:rPr>
+            <w:t>31</w:t>
+          </w:r>
+        </w:p>
+        <w:p>
+          <w:pPr>
+            <w:tabs>
+              <w:tab w:val="right" w:leader="dot" w:pos="10070"/>
+            </w:tabs>
+            <w:spacing w:before="0" w:after="20"/>
+            <w:ind w:left="240"/>
+          </w:pPr>
+          <w:r>
+            <w:rPr>
+              <w:color w:val="0F172A"/>
+            </w:rPr>
+            <w:t xml:space="preserve">6.2 Test Environment</w:t>
+          </w:r>
+          <w:r>
+            <w:rPr>
+              <w:color w:val="0F172A"/>
+            </w:rPr>
+            <w:tab/>
+          </w:r>
+          <w:r>
+            <w:rPr>
+              <w:color w:val="0F172A"/>
+            </w:rPr>
+            <w:t>31</w:t>
+          </w:r>
+        </w:p>
+        <w:p>
+          <w:pPr>
+            <w:tabs>
+              <w:tab w:val="right" w:leader="dot" w:pos="10070"/>
+            </w:tabs>
+            <w:spacing w:before="0" w:after="20"/>
+            <w:ind w:left="240"/>
+          </w:pPr>
+          <w:r>
+            <w:rPr>
+              <w:color w:val="0F172A"/>
+            </w:rPr>
+            <w:t xml:space="preserve">6.3 Test Suite Structure</w:t>
+          </w:r>
+          <w:r>
+            <w:rPr>
+              <w:color w:val="0F172A"/>
+            </w:rPr>
+            <w:tab/>
+          </w:r>
+          <w:r>
+            <w:rPr>
+              <w:color w:val="0F172A"/>
+            </w:rPr>
+            <w:t>31</w:t>
+          </w:r>
+        </w:p>
+        <w:p>
+          <w:pPr>
+            <w:tabs>
+              <w:tab w:val="right" w:leader="dot" w:pos="10070"/>
+            </w:tabs>
+            <w:spacing w:before="0" w:after="20"/>
+            <w:ind w:left="240"/>
+          </w:pPr>
+          <w:r>
+            <w:rPr>
+              <w:color w:val="0F172A"/>
+            </w:rPr>
+            <w:t xml:space="preserve">6.4 Representative Test Cases</w:t>
+          </w:r>
+          <w:r>
+            <w:rPr>
+              <w:color w:val="0F172A"/>
+            </w:rPr>
+            <w:tab/>
+          </w:r>
+          <w:r>
+            <w:rPr>
+              <w:color w:val="0F172A"/>
+            </w:rPr>
+            <w:t>32</w:t>
+          </w:r>
+        </w:p>
+        <w:p>
+          <w:pPr>
+            <w:tabs>
+              <w:tab w:val="right" w:leader="dot" w:pos="10070"/>
+            </w:tabs>
+            <w:spacing w:before="0" w:after="20"/>
+            <w:ind w:left="240"/>
+          </w:pPr>
+          <w:r>
+            <w:rPr>
+              <w:color w:val="0F172A"/>
+            </w:rPr>
+            <w:t xml:space="preserve">6.5 Test Results</w:t>
+          </w:r>
+          <w:r>
+            <w:rPr>
+              <w:color w:val="0F172A"/>
+            </w:rPr>
+            <w:tab/>
+          </w:r>
+          <w:r>
+            <w:rPr>
+              <w:color w:val="0F172A"/>
+            </w:rPr>
+            <w:t>33</w:t>
+          </w:r>
+        </w:p>
+        <w:p>
+          <w:pPr>
+            <w:tabs>
+              <w:tab w:val="right" w:leader="dot" w:pos="10070"/>
+            </w:tabs>
+            <w:spacing w:before="0" w:after="20"/>
+            <w:ind w:left="240"/>
+          </w:pPr>
+          <w:r>
+            <w:rPr>
+              <w:color w:val="0F172A"/>
+            </w:rPr>
+            <w:t xml:space="preserve">6.6 Known Test Limitations</w:t>
+          </w:r>
+          <w:r>
+            <w:rPr>
+              <w:color w:val="0F172A"/>
+            </w:rPr>
+            <w:tab/>
+          </w:r>
+          <w:r>
+            <w:rPr>
+              <w:color w:val="0F172A"/>
+            </w:rPr>
+            <w:t>33</w:t>
+          </w:r>
+        </w:p>
+        <w:p>
+          <w:pPr>
+            <w:tabs>
+              <w:tab w:val="right" w:leader="dot" w:pos="10070"/>
+            </w:tabs>
+            <w:spacing w:before="0" w:after="20"/>
+            <w:ind w:left="240"/>
+          </w:pPr>
+          <w:r>
+            <w:rPr>
+              <w:color w:val="0F172A"/>
+            </w:rPr>
+            <w:t xml:space="preserve">6.7 How to Run the Test Suite</w:t>
+          </w:r>
+          <w:r>
+            <w:rPr>
+              <w:color w:val="0F172A"/>
+            </w:rPr>
+            <w:tab/>
+          </w:r>
+          <w:r>
+            <w:rPr>
+              <w:color w:val="0F172A"/>
+            </w:rPr>
+            <w:t>33</w:t>
+          </w:r>
+        </w:p>
+        <w:p>
+          <w:pPr>
+            <w:tabs>
+              <w:tab w:val="right" w:leader="dot" w:pos="10070"/>
+            </w:tabs>
+            <w:spacing w:before="120" w:after="20"/>
+            <w:ind w:left="0"/>
+          </w:pPr>
+          <w:r>
+            <w:rPr>
+              <w:b/>
+              <w:bCs/>
+              <w:color w:val="0F172A"/>
+            </w:rPr>
+            <w:t xml:space="preserve">Chapter 7: Conclusion</w:t>
+          </w:r>
+          <w:r>
+            <w:rPr>
+              <w:b/>
+              <w:bCs/>
+              <w:color w:val="0F172A"/>
+            </w:rPr>
+            <w:tab/>
+          </w:r>
+          <w:r>
+            <w:rPr>
+              <w:b/>
+              <w:bCs/>
+              <w:color w:val="0F172A"/>
+            </w:rPr>
+            <w:t>35</w:t>
+          </w:r>
+        </w:p>
+        <w:p>
+          <w:pPr>
+            <w:tabs>
+              <w:tab w:val="right" w:leader="dot" w:pos="10070"/>
+            </w:tabs>
+            <w:spacing w:before="0" w:after="20"/>
+            <w:ind w:left="240"/>
+          </w:pPr>
+          <w:r>
+            <w:rPr>
+              <w:color w:val="0F172A"/>
+            </w:rPr>
+            <w:t xml:space="preserve">7.1 Summary of Achievements</w:t>
+          </w:r>
+          <w:r>
+            <w:rPr>
+              <w:color w:val="0F172A"/>
+            </w:rPr>
+            <w:tab/>
+          </w:r>
+          <w:r>
+            <w:rPr>
+              <w:color w:val="0F172A"/>
+            </w:rPr>
+            <w:t>35</w:t>
+          </w:r>
+        </w:p>
+        <w:p>
+          <w:pPr>
+            <w:tabs>
+              <w:tab w:val="right" w:leader="dot" w:pos="10070"/>
+            </w:tabs>
+            <w:spacing w:before="0" w:after="20"/>
+            <w:ind w:left="240"/>
+          </w:pPr>
+          <w:r>
+            <w:rPr>
+              <w:color w:val="0F172A"/>
+            </w:rPr>
+            <w:t xml:space="preserve">7.2 Challenges Encountered</w:t>
+          </w:r>
+          <w:r>
+            <w:rPr>
+              <w:color w:val="0F172A"/>
+            </w:rPr>
+            <w:tab/>
+          </w:r>
+          <w:r>
+            <w:rPr>
+              <w:color w:val="0F172A"/>
+            </w:rPr>
+            <w:t>35</w:t>
+          </w:r>
+        </w:p>
+        <w:p>
+          <w:pPr>
+            <w:tabs>
+              <w:tab w:val="right" w:leader="dot" w:pos="10070"/>
+            </w:tabs>
+            <w:spacing w:before="0" w:after="20"/>
+            <w:ind w:left="240"/>
+          </w:pPr>
+          <w:r>
+            <w:rPr>
+              <w:color w:val="0F172A"/>
+            </w:rPr>
+            <w:t xml:space="preserve">7.3 Limitations</w:t>
+          </w:r>
+          <w:r>
+            <w:rPr>
+              <w:color w:val="0F172A"/>
+            </w:rPr>
+            <w:tab/>
+          </w:r>
+          <w:r>
+            <w:rPr>
+              <w:color w:val="0F172A"/>
+            </w:rPr>
+            <w:t>35</w:t>
+          </w:r>
+        </w:p>
+        <w:p>
+          <w:pPr>
+            <w:tabs>
+              <w:tab w:val="right" w:leader="dot" w:pos="10070"/>
+            </w:tabs>
+            <w:spacing w:before="0" w:after="20"/>
+            <w:ind w:left="240"/>
+          </w:pPr>
+          <w:r>
+            <w:rPr>
+              <w:color w:val="0F172A"/>
+            </w:rPr>
+            <w:t xml:space="preserve">7.4 Future Work</w:t>
+          </w:r>
+          <w:r>
+            <w:rPr>
+              <w:color w:val="0F172A"/>
+            </w:rPr>
+            <w:tab/>
+          </w:r>
+          <w:r>
+            <w:rPr>
+              <w:color w:val="0F172A"/>
+            </w:rPr>
+            <w:t>35</w:t>
+          </w:r>
+        </w:p>
+        <w:p>
+          <w:pPr>
+            <w:tabs>
+              <w:tab w:val="right" w:leader="dot" w:pos="10070"/>
+            </w:tabs>
+            <w:spacing w:before="0" w:after="20"/>
+            <w:ind w:left="240"/>
+          </w:pPr>
+          <w:r>
+            <w:rPr>
+              <w:color w:val="0F172A"/>
+            </w:rPr>
+            <w:t xml:space="preserve">7.5 Final Remarks</w:t>
+          </w:r>
+          <w:r>
+            <w:rPr>
+              <w:color w:val="0F172A"/>
+            </w:rPr>
+            <w:tab/>
+          </w:r>
+          <w:r>
+            <w:rPr>
+              <w:color w:val="0F172A"/>
+            </w:rPr>
+            <w:t>36</w:t>
+          </w:r>
+        </w:p>
+        <w:p>
+          <w:pPr>
+            <w:tabs>
+              <w:tab w:val="right" w:leader="dot" w:pos="10070"/>
+            </w:tabs>
+            <w:spacing w:before="120" w:after="20"/>
+            <w:ind w:left="0"/>
+          </w:pPr>
+          <w:r>
+            <w:rPr>
+              <w:b/>
+              <w:bCs/>
+              <w:color w:val="0F172A"/>
+            </w:rPr>
+            <w:t xml:space="preserve">Appendix A: Installation Guide</w:t>
+          </w:r>
+          <w:r>
+            <w:rPr>
+              <w:b/>
+              <w:bCs/>
+              <w:color w:val="0F172A"/>
+            </w:rPr>
+            <w:tab/>
+          </w:r>
+          <w:r>
+            <w:rPr>
+              <w:b/>
+              <w:bCs/>
+              <w:color w:val="0F172A"/>
+            </w:rPr>
+            <w:t>37</w:t>
+          </w:r>
+        </w:p>
+        <w:p>
+          <w:pPr>
+            <w:tabs>
+              <w:tab w:val="right" w:leader="dot" w:pos="10070"/>
+            </w:tabs>
+            <w:spacing w:before="0" w:after="20"/>
+            <w:ind w:left="240"/>
+          </w:pPr>
+          <w:r>
+            <w:rPr>
+              <w:color w:val="0F172A"/>
+            </w:rPr>
+            <w:t xml:space="preserve">A.1 Prerequisites</w:t>
+          </w:r>
+          <w:r>
+            <w:rPr>
+              <w:color w:val="0F172A"/>
+            </w:rPr>
+            <w:tab/>
+          </w:r>
+          <w:r>
+            <w:rPr>
+              <w:color w:val="0F172A"/>
+            </w:rPr>
+            <w:t>37</w:t>
+          </w:r>
+        </w:p>
+        <w:p>
+          <w:pPr>
+            <w:tabs>
+              <w:tab w:val="right" w:leader="dot" w:pos="10070"/>
+            </w:tabs>
+            <w:spacing w:before="0" w:after="20"/>
+            <w:ind w:left="240"/>
+          </w:pPr>
+          <w:r>
+            <w:rPr>
+              <w:color w:val="0F172A"/>
+            </w:rPr>
+            <w:t xml:space="preserve">A.2 Option 1 — Docker (Recommended)</w:t>
+          </w:r>
+          <w:r>
+            <w:rPr>
+              <w:color w:val="0F172A"/>
+            </w:rPr>
+            <w:tab/>
+          </w:r>
+          <w:r>
+            <w:rPr>
+              <w:color w:val="0F172A"/>
+            </w:rPr>
+            <w:t>37</w:t>
+          </w:r>
+        </w:p>
+        <w:p>
+          <w:pPr>
+            <w:tabs>
+              <w:tab w:val="right" w:leader="dot" w:pos="10070"/>
+            </w:tabs>
+            <w:spacing w:before="0" w:after="20"/>
+            <w:ind w:left="240"/>
+          </w:pPr>
+          <w:r>
+            <w:rPr>
+              <w:color w:val="0F172A"/>
+            </w:rPr>
+            <w:t xml:space="preserve">A.3 Option 2 — Local Installation (Without Docker)</w:t>
+          </w:r>
+          <w:r>
+            <w:rPr>
+              <w:color w:val="0F172A"/>
+            </w:rPr>
+            <w:tab/>
+          </w:r>
+          <w:r>
+            <w:rPr>
+              <w:color w:val="0F172A"/>
+            </w:rPr>
+            <w:t>37</w:t>
+          </w:r>
+        </w:p>
+        <w:p>
+          <w:pPr>
+            <w:tabs>
+              <w:tab w:val="right" w:leader="dot" w:pos="10070"/>
+            </w:tabs>
+            <w:spacing w:before="0" w:after="20"/>
+            <w:ind w:left="240"/>
+          </w:pPr>
+          <w:r>
+            <w:rPr>
+              <w:color w:val="0F172A"/>
+            </w:rPr>
+            <w:t xml:space="preserve">A.4 Environment Variables</w:t>
+          </w:r>
+          <w:r>
+            <w:rPr>
+              <w:color w:val="0F172A"/>
+            </w:rPr>
+            <w:tab/>
+          </w:r>
+          <w:r>
+            <w:rPr>
+              <w:color w:val="0F172A"/>
+            </w:rPr>
+            <w:t>38</w:t>
+          </w:r>
+        </w:p>
+        <w:p>
+          <w:pPr>
+            <w:tabs>
+              <w:tab w:val="right" w:leader="dot" w:pos="10070"/>
+            </w:tabs>
+            <w:spacing w:before="0" w:after="20"/>
+            <w:ind w:left="240"/>
+          </w:pPr>
+          <w:r>
+            <w:rPr>
+              <w:color w:val="0F172A"/>
+            </w:rPr>
+            <w:t xml:space="preserve">A.5 Demo Credentials</w:t>
+          </w:r>
+          <w:r>
+            <w:rPr>
+              <w:color w:val="0F172A"/>
+            </w:rPr>
+            <w:tab/>
+          </w:r>
+          <w:r>
+            <w:rPr>
+              <w:color w:val="0F172A"/>
+            </w:rPr>
+            <w:t>38</w:t>
+          </w:r>
+        </w:p>
+        <w:p>
+          <w:pPr>
+            <w:tabs>
+              <w:tab w:val="right" w:leader="dot" w:pos="10070"/>
+            </w:tabs>
+            <w:spacing w:before="0" w:after="20"/>
+            <w:ind w:left="240"/>
+          </w:pPr>
+          <w:r>
+            <w:rPr>
+              <w:color w:val="0F172A"/>
+            </w:rPr>
+            <w:t xml:space="preserve">A.6 Running the Test Suite</w:t>
+          </w:r>
+          <w:r>
+            <w:rPr>
+              <w:color w:val="0F172A"/>
+            </w:rPr>
+            <w:tab/>
+          </w:r>
+          <w:r>
+            <w:rPr>
+              <w:color w:val="0F172A"/>
+            </w:rPr>
+            <w:t>38</w:t>
+          </w:r>
+        </w:p>
+        <w:p>
+          <w:pPr>
+            <w:tabs>
+              <w:tab w:val="right" w:leader="dot" w:pos="10070"/>
+            </w:tabs>
+            <w:spacing w:before="0" w:after="20"/>
+            <w:ind w:left="240"/>
+          </w:pPr>
+          <w:r>
+            <w:rPr>
+              <w:color w:val="0F172A"/>
+            </w:rPr>
+            <w:t xml:space="preserve">A.7 Troubleshooting</w:t>
+          </w:r>
+          <w:r>
+            <w:rPr>
+              <w:color w:val="0F172A"/>
+            </w:rPr>
+            <w:tab/>
+          </w:r>
+          <w:r>
+            <w:rPr>
+              <w:color w:val="0F172A"/>
+            </w:rPr>
+            <w:t>39</w:t>
+          </w:r>
+        </w:p>
+        <w:p>
+          <w:pPr>
+            <w:tabs>
+              <w:tab w:val="right" w:leader="dot" w:pos="10070"/>
+            </w:tabs>
+            <w:spacing w:before="120" w:after="20"/>
+            <w:ind w:left="0"/>
+          </w:pPr>
+          <w:r>
+            <w:rPr>
+              <w:b/>
+              <w:bCs/>
+              <w:color w:val="0F172A"/>
+            </w:rPr>
+            <w:t xml:space="preserve">Appendix B: User Manual</w:t>
+          </w:r>
+          <w:r>
+            <w:rPr>
+              <w:b/>
+              <w:bCs/>
+              <w:color w:val="0F172A"/>
+            </w:rPr>
+            <w:tab/>
+          </w:r>
+          <w:r>
+            <w:rPr>
+              <w:b/>
+              <w:bCs/>
+              <w:color w:val="0F172A"/>
+            </w:rPr>
+            <w:t>40</w:t>
+          </w:r>
+        </w:p>
+        <w:p>
+          <w:pPr>
+            <w:tabs>
+              <w:tab w:val="right" w:leader="dot" w:pos="10070"/>
+            </w:tabs>
+            <w:spacing w:before="0" w:after="20"/>
+            <w:ind w:left="240"/>
+          </w:pPr>
+          <w:r>
+            <w:rPr>
+              <w:color w:val="0F172A"/>
+            </w:rPr>
+            <w:t xml:space="preserve">B.1 Getting Started</w:t>
+          </w:r>
+          <w:r>
+            <w:rPr>
+              <w:color w:val="0F172A"/>
+            </w:rPr>
+            <w:tab/>
+          </w:r>
+          <w:r>
+            <w:rPr>
+              <w:color w:val="0F172A"/>
+            </w:rPr>
+            <w:t>40</w:t>
+          </w:r>
+        </w:p>
+        <w:p>
+          <w:pPr>
+            <w:tabs>
+              <w:tab w:val="right" w:leader="dot" w:pos="10070"/>
+            </w:tabs>
+            <w:spacing w:before="0" w:after="20"/>
+            <w:ind w:left="240"/>
+          </w:pPr>
+          <w:r>
+            <w:rPr>
+              <w:color w:val="0F172A"/>
+            </w:rPr>
+            <w:t xml:space="preserve">B.2 Property Owner &amp; Property Manager Guide</w:t>
+          </w:r>
+          <w:r>
+            <w:rPr>
+              <w:color w:val="0F172A"/>
+            </w:rPr>
+            <w:tab/>
+          </w:r>
+          <w:r>
+            <w:rPr>
+              <w:color w:val="0F172A"/>
+            </w:rPr>
+            <w:t>40</w:t>
+          </w:r>
+        </w:p>
+        <w:p>
+          <w:pPr>
+            <w:tabs>
+              <w:tab w:val="right" w:leader="dot" w:pos="10070"/>
+            </w:tabs>
+            <w:spacing w:before="0" w:after="20"/>
+            <w:ind w:left="480"/>
+          </w:pPr>
+          <w:r>
+            <w:rPr>
+              <w:color w:val="0F172A"/>
+            </w:rPr>
+            <w:t xml:space="preserve">B.2.1 Add a Property</w:t>
+          </w:r>
+          <w:r>
+            <w:rPr>
+              <w:color w:val="0F172A"/>
+            </w:rPr>
+            <w:tab/>
+          </w:r>
+          <w:r>
+            <w:rPr>
+              <w:color w:val="0F172A"/>
+            </w:rPr>
+            <w:t>40</w:t>
+          </w:r>
+        </w:p>
+        <w:p>
+          <w:pPr>
+            <w:tabs>
+              <w:tab w:val="right" w:leader="dot" w:pos="10070"/>
+            </w:tabs>
+            <w:spacing w:before="0" w:after="20"/>
+            <w:ind w:left="480"/>
+          </w:pPr>
+          <w:r>
+            <w:rPr>
+              <w:color w:val="0F172A"/>
+            </w:rPr>
+            <w:t xml:space="preserve">B.2.2 Add a Unit</w:t>
+          </w:r>
+          <w:r>
+            <w:rPr>
+              <w:color w:val="0F172A"/>
+            </w:rPr>
+            <w:tab/>
+          </w:r>
+          <w:r>
+            <w:rPr>
+              <w:color w:val="0F172A"/>
+            </w:rPr>
+            <w:t>40</w:t>
+          </w:r>
+        </w:p>
+        <w:p>
+          <w:pPr>
+            <w:tabs>
+              <w:tab w:val="right" w:leader="dot" w:pos="10070"/>
+            </w:tabs>
+            <w:spacing w:before="0" w:after="20"/>
+            <w:ind w:left="480"/>
+          </w:pPr>
+          <w:r>
+            <w:rPr>
+              <w:color w:val="0F172A"/>
+            </w:rPr>
+            <w:t xml:space="preserve">B.2.3 Onboard a Tenant</w:t>
+          </w:r>
+          <w:r>
+            <w:rPr>
+              <w:color w:val="0F172A"/>
+            </w:rPr>
+            <w:tab/>
+          </w:r>
+          <w:r>
+            <w:rPr>
+              <w:color w:val="0F172A"/>
+            </w:rPr>
+            <w:t>40</w:t>
+          </w:r>
+        </w:p>
+        <w:p>
+          <w:pPr>
+            <w:tabs>
+              <w:tab w:val="right" w:leader="dot" w:pos="10070"/>
+            </w:tabs>
+            <w:spacing w:before="0" w:after="20"/>
+            <w:ind w:left="480"/>
+          </w:pPr>
+          <w:r>
+            <w:rPr>
+              <w:color w:val="0F172A"/>
+            </w:rPr>
+            <w:t xml:space="preserve">B.2.4 Upload a Lease and Activate a Tenancy</w:t>
+          </w:r>
+          <w:r>
+            <w:rPr>
+              <w:color w:val="0F172A"/>
+            </w:rPr>
+            <w:tab/>
+          </w:r>
+          <w:r>
+            <w:rPr>
+              <w:color w:val="0F172A"/>
+            </w:rPr>
+            <w:t>40</w:t>
+          </w:r>
+        </w:p>
+        <w:p>
+          <w:pPr>
+            <w:tabs>
+              <w:tab w:val="right" w:leader="dot" w:pos="10070"/>
+            </w:tabs>
+            <w:spacing w:before="0" w:after="20"/>
+            <w:ind w:left="480"/>
+          </w:pPr>
+          <w:r>
+            <w:rPr>
+              <w:color w:val="0F172A"/>
+            </w:rPr>
+            <w:t xml:space="preserve">B.2.5 Record a Rent Payment</w:t>
+          </w:r>
+          <w:r>
+            <w:rPr>
+              <w:color w:val="0F172A"/>
+            </w:rPr>
+            <w:tab/>
+          </w:r>
+          <w:r>
+            <w:rPr>
+              <w:color w:val="0F172A"/>
+            </w:rPr>
+            <w:t>41</w:t>
+          </w:r>
+        </w:p>
+        <w:p>
+          <w:pPr>
+            <w:tabs>
+              <w:tab w:val="right" w:leader="dot" w:pos="10070"/>
+            </w:tabs>
+            <w:spacing w:before="0" w:after="20"/>
+            <w:ind w:left="480"/>
+          </w:pPr>
+          <w:r>
+            <w:rPr>
+              <w:color w:val="0F172A"/>
+            </w:rPr>
+            <w:t xml:space="preserve">B.2.6 Generate a Rent Statement</w:t>
+          </w:r>
+          <w:r>
+            <w:rPr>
+              <w:color w:val="0F172A"/>
+            </w:rPr>
+            <w:tab/>
+          </w:r>
+          <w:r>
+            <w:rPr>
+              <w:color w:val="0F172A"/>
+            </w:rPr>
+            <w:t>41</w:t>
+          </w:r>
+        </w:p>
+        <w:p>
+          <w:pPr>
+            <w:tabs>
+              <w:tab w:val="right" w:leader="dot" w:pos="10070"/>
+            </w:tabs>
+            <w:spacing w:before="0" w:after="20"/>
+            <w:ind w:left="480"/>
+          </w:pPr>
+          <w:r>
+            <w:rPr>
+              <w:color w:val="0F172A"/>
+            </w:rPr>
+            <w:t xml:space="preserve">B.2.7 Manage a Maintenance Request</w:t>
+          </w:r>
+          <w:r>
+            <w:rPr>
+              <w:color w:val="0F172A"/>
+            </w:rPr>
+            <w:tab/>
+          </w:r>
+          <w:r>
+            <w:rPr>
+              <w:color w:val="0F172A"/>
+            </w:rPr>
+            <w:t>41</w:t>
+          </w:r>
+        </w:p>
+        <w:p>
+          <w:pPr>
+            <w:tabs>
+              <w:tab w:val="right" w:leader="dot" w:pos="10070"/>
+            </w:tabs>
+            <w:spacing w:before="0" w:after="20"/>
+            <w:ind w:left="480"/>
+          </w:pPr>
+          <w:r>
+            <w:rPr>
+              <w:color w:val="0F172A"/>
+            </w:rPr>
+            <w:t xml:space="preserve">B.2.8 View Reports</w:t>
+          </w:r>
+          <w:r>
+            <w:rPr>
+              <w:color w:val="0F172A"/>
+            </w:rPr>
+            <w:tab/>
+          </w:r>
+          <w:r>
+            <w:rPr>
+              <w:color w:val="0F172A"/>
+            </w:rPr>
+            <w:t>41</w:t>
+          </w:r>
+        </w:p>
+        <w:p>
+          <w:pPr>
+            <w:tabs>
+              <w:tab w:val="right" w:leader="dot" w:pos="10070"/>
+            </w:tabs>
+            <w:spacing w:before="0" w:after="20"/>
+            <w:ind w:left="240"/>
+          </w:pPr>
+          <w:r>
+            <w:rPr>
+              <w:color w:val="0F172A"/>
+            </w:rPr>
+            <w:t xml:space="preserve">B.3 Tenant Guide</w:t>
+          </w:r>
+          <w:r>
+            <w:rPr>
+              <w:color w:val="0F172A"/>
+            </w:rPr>
+            <w:tab/>
+          </w:r>
+          <w:r>
+            <w:rPr>
+              <w:color w:val="0F172A"/>
+            </w:rPr>
+            <w:t>41</w:t>
+          </w:r>
+        </w:p>
+        <w:p>
+          <w:pPr>
+            <w:tabs>
+              <w:tab w:val="right" w:leader="dot" w:pos="10070"/>
+            </w:tabs>
+            <w:spacing w:before="0" w:after="20"/>
+            <w:ind w:left="480"/>
+          </w:pPr>
+          <w:r>
+            <w:rPr>
+              <w:color w:val="0F172A"/>
+            </w:rPr>
+            <w:t xml:space="preserve">B.3.1 Your Dashboard</w:t>
+          </w:r>
+          <w:r>
+            <w:rPr>
+              <w:color w:val="0F172A"/>
+            </w:rPr>
+            <w:tab/>
+          </w:r>
+          <w:r>
+            <w:rPr>
+              <w:color w:val="0F172A"/>
+            </w:rPr>
+            <w:t>41</w:t>
+          </w:r>
+        </w:p>
+        <w:p>
+          <w:pPr>
+            <w:tabs>
+              <w:tab w:val="right" w:leader="dot" w:pos="10070"/>
+            </w:tabs>
+            <w:spacing w:before="0" w:after="20"/>
+            <w:ind w:left="480"/>
+          </w:pPr>
+          <w:r>
+            <w:rPr>
+              <w:color w:val="0F172A"/>
+            </w:rPr>
+            <w:t xml:space="preserve">B.3.2 Pay Rent Online</w:t>
+          </w:r>
+          <w:r>
+            <w:rPr>
+              <w:color w:val="0F172A"/>
+            </w:rPr>
+            <w:tab/>
+          </w:r>
+          <w:r>
+            <w:rPr>
+              <w:color w:val="0F172A"/>
+            </w:rPr>
+            <w:t>41</w:t>
+          </w:r>
+        </w:p>
+        <w:p>
+          <w:pPr>
+            <w:tabs>
+              <w:tab w:val="right" w:leader="dot" w:pos="10070"/>
+            </w:tabs>
+            <w:spacing w:before="0" w:after="20"/>
+            <w:ind w:left="480"/>
+          </w:pPr>
+          <w:r>
+            <w:rPr>
+              <w:color w:val="0F172A"/>
+            </w:rPr>
+            <w:t xml:space="preserve">B.3.3 View Your Payment History</w:t>
+          </w:r>
+          <w:r>
+            <w:rPr>
+              <w:color w:val="0F172A"/>
+            </w:rPr>
+            <w:tab/>
+          </w:r>
+          <w:r>
+            <w:rPr>
+              <w:color w:val="0F172A"/>
+            </w:rPr>
+            <w:t>41</w:t>
+          </w:r>
+        </w:p>
+        <w:p>
+          <w:pPr>
+            <w:tabs>
+              <w:tab w:val="right" w:leader="dot" w:pos="10070"/>
+            </w:tabs>
+            <w:spacing w:before="0" w:after="20"/>
+            <w:ind w:left="480"/>
+          </w:pPr>
+          <w:r>
+            <w:rPr>
+              <w:color w:val="0F172A"/>
+            </w:rPr>
+            <w:t xml:space="preserve">B.3.4 Submit a Maintenance Request</w:t>
+          </w:r>
+          <w:r>
+            <w:rPr>
+              <w:color w:val="0F172A"/>
+            </w:rPr>
+            <w:tab/>
+          </w:r>
+          <w:r>
+            <w:rPr>
+              <w:color w:val="0F172A"/>
+            </w:rPr>
+            <w:t>42</w:t>
+          </w:r>
+        </w:p>
+        <w:p>
+          <w:pPr>
+            <w:tabs>
+              <w:tab w:val="right" w:leader="dot" w:pos="10070"/>
+            </w:tabs>
+            <w:spacing w:before="0" w:after="20"/>
+            <w:ind w:left="480"/>
+          </w:pPr>
+          <w:r>
+            <w:rPr>
+              <w:color w:val="0F172A"/>
+            </w:rPr>
+            <w:t xml:space="preserve">B.3.5 Respond to a Completed Request</w:t>
+          </w:r>
+          <w:r>
+            <w:rPr>
+              <w:color w:val="0F172A"/>
+            </w:rPr>
+            <w:tab/>
+          </w:r>
+          <w:r>
+            <w:rPr>
+              <w:color w:val="0F172A"/>
+            </w:rPr>
+            <w:t>42</w:t>
+          </w:r>
+        </w:p>
+        <w:p>
+          <w:pPr>
+            <w:tabs>
+              <w:tab w:val="right" w:leader="dot" w:pos="10070"/>
+            </w:tabs>
+            <w:spacing w:before="0" w:after="20"/>
+            <w:ind w:left="240"/>
+          </w:pPr>
+          <w:r>
+            <w:rPr>
+              <w:color w:val="0F172A"/>
+            </w:rPr>
+            <w:t xml:space="preserve">B.4 Maintenance Staff Guide</w:t>
+          </w:r>
+          <w:r>
+            <w:rPr>
+              <w:color w:val="0F172A"/>
+            </w:rPr>
+            <w:tab/>
+          </w:r>
+          <w:r>
+            <w:rPr>
+              <w:color w:val="0F172A"/>
+            </w:rPr>
+            <w:t>42</w:t>
+          </w:r>
+        </w:p>
+        <w:p>
+          <w:pPr>
+            <w:tabs>
+              <w:tab w:val="right" w:leader="dot" w:pos="10070"/>
+            </w:tabs>
+            <w:spacing w:before="0" w:after="20"/>
+            <w:ind w:left="240"/>
+          </w:pPr>
+          <w:r>
+            <w:rPr>
+              <w:color w:val="0F172A"/>
+            </w:rPr>
+            <w:t xml:space="preserve">B.5 Common Questions</w:t>
+          </w:r>
+          <w:r>
+            <w:rPr>
+              <w:color w:val="0F172A"/>
+            </w:rPr>
+            <w:tab/>
+          </w:r>
+          <w:r>
+            <w:rPr>
+              <w:color w:val="0F172A"/>
+            </w:rPr>
+            <w:t>42</w:t>
+          </w:r>
+        </w:p>
+        <w:p>
+          <w:pPr>
+            <w:tabs>
+              <w:tab w:val="right" w:leader="dot" w:pos="10070"/>
+            </w:tabs>
+            <w:spacing w:before="120" w:after="20"/>
+            <w:ind w:left="0"/>
+          </w:pPr>
+          <w:r>
+            <w:rPr>
+              <w:b/>
+              <w:bCs/>
+              <w:color w:val="0F172A"/>
+            </w:rPr>
+            <w:t xml:space="preserve">Appendix C: Updates Since Deliverable 4 (October 2026)</w:t>
+          </w:r>
+          <w:r>
+            <w:rPr>
+              <w:b/>
+              <w:bCs/>
+              <w:color w:val="0F172A"/>
+            </w:rPr>
+            <w:tab/>
+          </w:r>
+          <w:r>
+            <w:rPr>
+              <w:b/>
+              <w:bCs/>
+              <w:color w:val="0F172A"/>
+            </w:rPr>
+            <w:t>43</w:t>
+          </w:r>
+        </w:p>
+        <w:p>
+          <w:pPr>
+            <w:tabs>
+              <w:tab w:val="right" w:leader="dot" w:pos="10070"/>
+            </w:tabs>
+            <w:spacing w:before="0" w:after="20"/>
+            <w:ind w:left="240"/>
+          </w:pPr>
+          <w:r>
+            <w:rPr>
+              <w:color w:val="0F172A"/>
+            </w:rPr>
+            <w:t xml:space="preserve">C.1 Summary of Changes</w:t>
+          </w:r>
+          <w:r>
+            <w:rPr>
+              <w:color w:val="0F172A"/>
+            </w:rPr>
+            <w:tab/>
+          </w:r>
+          <w:r>
+            <w:rPr>
+              <w:color w:val="0F172A"/>
+            </w:rPr>
+            <w:t>43</w:t>
+          </w:r>
+        </w:p>
+        <w:p>
+          <w:pPr>
+            <w:tabs>
+              <w:tab w:val="right" w:leader="dot" w:pos="10070"/>
+            </w:tabs>
+            <w:spacing w:before="0" w:after="20"/>
+            <w:ind w:left="240"/>
+          </w:pPr>
+          <w:r>
+            <w:rPr>
+              <w:color w:val="0F172A"/>
+            </w:rPr>
+            <w:t xml:space="preserve">C.2 Current Figures</w:t>
+          </w:r>
+          <w:r>
+            <w:rPr>
+              <w:color w:val="0F172A"/>
+            </w:rPr>
+            <w:tab/>
+          </w:r>
+          <w:r>
+            <w:rPr>
+              <w:color w:val="0F172A"/>
+            </w:rPr>
+            <w:t>44</w:t>
+          </w:r>
+        </w:p>
+        <w:p>
+          <w:pPr>
+            <w:tabs>
+              <w:tab w:val="right" w:leader="dot" w:pos="10070"/>
+            </w:tabs>
+            <w:spacing w:before="0" w:after="20"/>
+            <w:ind w:left="240"/>
+          </w:pPr>
+          <w:r>
+            <w:rPr>
+              <w:color w:val="0F172A"/>
+            </w:rPr>
+            <w:t xml:space="preserve">C.3 Language Support and the SRS</w:t>
+          </w:r>
+          <w:r>
+            <w:rPr>
+              <w:color w:val="0F172A"/>
+            </w:rPr>
+            <w:tab/>
+          </w:r>
+          <w:r>
+            <w:rPr>
+              <w:color w:val="0F172A"/>
+            </w:rPr>
+            <w:t>44</w:t>
+          </w:r>
+        </w:p>
+        <w:p>
+          <w:pPr>
+            <w:tabs>
+              <w:tab w:val="right" w:leader="dot" w:pos="10070"/>
+            </w:tabs>
+            <w:spacing w:before="0" w:after="20"/>
+            <w:ind w:left="240"/>
+          </w:pPr>
+          <w:r>
+            <w:rPr>
+              <w:color w:val="0F172A"/>
+            </w:rPr>
+            <w:t xml:space="preserve">C.4 The Current Interface</w:t>
+          </w:r>
+          <w:r>
+            <w:rPr>
+              <w:color w:val="0F172A"/>
+            </w:rPr>
+            <w:tab/>
+          </w:r>
+          <w:r>
+            <w:rPr>
+              <w:color w:val="0F172A"/>
+            </w:rPr>
+            <w:t>45</w:t>
+          </w:r>
+        </w:p>
+        <w:p>
+          <w:pPr>
+            <w:tabs>
+              <w:tab w:val="right" w:leader="dot" w:pos="10070"/>
+            </w:tabs>
+            <w:spacing w:before="0" w:after="20"/>
+            <w:ind w:left="240"/>
+          </w:pPr>
+          <w:r>
+            <w:rPr>
+              <w:color w:val="0F172A"/>
+            </w:rPr>
+            <w:t xml:space="preserve">C.5 Updated Demo Accounts and Data</w:t>
+          </w:r>
+          <w:r>
+            <w:rPr>
+              <w:color w:val="0F172A"/>
+            </w:rPr>
+            <w:tab/>
+          </w:r>
+          <w:r>
+            <w:rPr>
+              <w:color w:val="0F172A"/>
+            </w:rPr>
+            <w:t>47</w:t>
           </w:r>
         </w:p>
         <w:p>
@@ -675,7 +3514,7 @@
           <w:sz w:val="21"/>
           <w:szCs w:val="21"/>
         </w:rPr>
-        <w:t>Note: this document records RentalPro as submitted for Deliverable 4, and every figure in it (93 tests, 77% coverage, 31 templates) is that of the system at the time. Appendix C summarises everything added since — the eleven gaps closed in Deliverable 5, the billing engine, the redesigned Harare interface, English, Shona and Arabic, and production hardening — with today's figures (18 tables, 298 tests, 85% coverage).</w:t>
+        <w:t>Note: this document records RentalPro as it stood at Deliverable 4, and every figure in it (93 tests, 77% coverage, 31 templates) is that of the system at the time. Appendix C summarises everything added since — the eleven gaps closed in Deliverable 5, the billing engine, the redesigned Harare interface, English, Shona and Arabic, production hardening and deployment to Render — with today's figures (18 tables, 305 tests, 86% coverage).</w:t>
       </w:r>
     </w:p>
     <w:p>
@@ -1455,7 +4294,7 @@
           <w:sz w:val="21"/>
           <w:szCs w:val="21"/>
         </w:rPr>
-        <w:t xml:space="preserve">RentalPro is a server-rendered Flask web application backed by a relational database (SQLite in development and test, PostgreSQL in Docker/production). It supports five roles — Property Owner, Property Manager, Tenant, Maintenance Staff, and Administrator — each with a role-specific dashboard and a restricted set of actions enforced both by route-level guards and by data-level ownership checks. The remaining chapters of this report cover the analysis (Chapter 2), design (Chapters 3–4), implementation (Chapter 5), and verification (Chapter 6) of the system, followed by a conclusion (Chapter 7) and two appendices covering installation and day-to-day use.</w:t>
+        <w:t>RentalPro is a server-rendered Flask web application backed by a relational database (SQLite in development and test, PostgreSQL in Docker/production). It supports five roles — Property Owner, Property Manager, Tenant, Maintenance Staff, and Administrator — each with a role-specific dashboard and a restricted set of actions enforced both by route-level guards and by data-level ownership checks. The remaining chapters of this report cover the analysis (Chapter 2), design (Chapters 3–4), implementation (Chapter 5), and verification (Chapter 6) of the system, followed by a conclusion (Chapter 7) and three appendices covering installation, day-to-day use, and what has changed since Deliverable 4.</w:t>
       </w:r>
     </w:p>
     <w:p>
@@ -29387,7 +32226,7 @@
           <w:sz w:val="21"/>
           <w:szCs w:val="21"/>
         </w:rPr>
-        <w:t>This section brings the document up to date. The rest of the document describes RentalPro as submitted for Deliverable 4, and its figures are deliberately left as they were at that time. Since then, Deliverable 5 closed eleven gaps against the SRS, and the system has gained a billing engine, a property map, a redesigned interface, English, Shona and Arabic interface languages, Harare demonstration data, a tenant history page for each unit and a maintenance summary report, and finally full Arabic and production hardening. Each change was made additively, behind the existing test suite, with new tests of its own.</w:t>
+        <w:t>This section brings the document up to date. The rest of the document describes RentalPro as it stood at Deliverable 4, and its figures are deliberately left as they were at that time. Since then, Deliverable 5 closed eleven gaps against the SRS, and the system has gained a billing engine, a property map, a redesigned interface, English, Shona and Arabic interface languages, Harare demonstration data, a tenant history page for each unit and a maintenance summary report, full Arabic and production hardening, and finally deployment to Render. Each change was made additively, behind the existing test suite, with new tests of its own.</w:t>
       </w:r>
     </w:p>
     <w:p>
@@ -30274,6 +33113,83 @@
           </w:p>
         </w:tc>
       </w:tr>
+      <w:tr>
+        <w:tc>
+          <w:tcPr>
+            <w:tcW w:type="dxa" w:w="1900"/>
+            <w:shd w:fill="FFFFFF" w:color="auto" w:val="clear"/>
+            <w:tcMar>
+              <w:top w:type="dxa" w:w="60"/>
+              <w:left w:type="dxa" w:w="100"/>
+              <w:bottom w:type="dxa" w:w="60"/>
+              <w:right w:type="dxa" w:w="100"/>
+            </w:tcMar>
+            <w:vAlign w:val="center"/>
+          </w:tcPr>
+          <w:p>
+            <w:r>
+              <w:rPr>
+                <w:b w:val="false"/>
+                <w:bCs w:val="false"/>
+                <w:color w:val="1E293B"/>
+                <w:sz w:val="18"/>
+                <w:szCs w:val="18"/>
+              </w:rPr>
+              <w:t>Cloud deployment</w:t>
+            </w:r>
+          </w:p>
+        </w:tc>
+        <w:tc>
+          <w:tcPr>
+            <w:tcW w:type="dxa" w:w="6260"/>
+            <w:shd w:fill="FFFFFF" w:color="auto" w:val="clear"/>
+            <w:tcMar>
+              <w:top w:type="dxa" w:w="60"/>
+              <w:left w:type="dxa" w:w="100"/>
+              <w:bottom w:type="dxa" w:w="60"/>
+              <w:right w:type="dxa" w:w="100"/>
+            </w:tcMar>
+            <w:vAlign w:val="center"/>
+          </w:tcPr>
+          <w:p>
+            <w:r>
+              <w:rPr>
+                <w:b w:val="false"/>
+                <w:bCs w:val="false"/>
+                <w:color w:val="1E293B"/>
+                <w:sz w:val="18"/>
+                <w:szCs w:val="18"/>
+              </w:rPr>
+              <w:t>render.yaml deploys the Docker image and a PostgreSQL database to Render, the cloud host planned in Deliverable 3, served over HTTPS. Behind the host's proxy the app recognises HTTPS and each visitor's own address (TRUST_FORWARDED_PROTO and CLIENT_IP_HEADER, both off by default), database URLs name the installed PostgreSQL driver, and only one Gunicorn worker runs the background jobs.</w:t>
+            </w:r>
+          </w:p>
+        </w:tc>
+        <w:tc>
+          <w:tcPr>
+            <w:tcW w:type="dxa" w:w="1200"/>
+            <w:shd w:fill="FFFFFF" w:color="auto" w:val="clear"/>
+            <w:tcMar>
+              <w:top w:type="dxa" w:w="60"/>
+              <w:left w:type="dxa" w:w="100"/>
+              <w:bottom w:type="dxa" w:w="60"/>
+              <w:right w:type="dxa" w:w="100"/>
+            </w:tcMar>
+            <w:vAlign w:val="center"/>
+          </w:tcPr>
+          <w:p>
+            <w:r>
+              <w:rPr>
+                <w:b w:val="false"/>
+                <w:bCs w:val="false"/>
+                <w:color w:val="1E293B"/>
+                <w:sz w:val="18"/>
+                <w:szCs w:val="18"/>
+              </w:rPr>
+              <w:t>7</w:t>
+            </w:r>
+          </w:p>
+        </w:tc>
+      </w:tr>
     </w:tbl>
     <w:p>
       <w:pPr>
@@ -30851,7 +33767,7 @@
                 <w:sz w:val="18"/>
                 <w:szCs w:val="18"/>
               </w:rPr>
-              <w:t>298</w:t>
+              <w:t>305</w:t>
             </w:r>
           </w:p>
         </w:tc>
@@ -30928,7 +33844,7 @@
                 <w:sz w:val="18"/>
                 <w:szCs w:val="18"/>
               </w:rPr>
-              <w:t>85%</w:t>
+              <w:t>86%</w:t>
             </w:r>
           </w:p>
         </w:tc>
@@ -31027,7 +33943,7 @@
           <w:sz w:val="21"/>
           <w:szCs w:val="21"/>
         </w:rPr>
-        <w:t>All 298 tests pass with no failures, and the suite still runs entirely offline, with no paid external account needed.</w:t>
+        <w:t>All 305 tests pass with no failures, and the suite still runs entirely offline, with no paid external account needed.</w:t>
       </w:r>
     </w:p>
     <w:p>
@@ -31487,6 +34403,20 @@
           <w:szCs w:val="21"/>
         </w:rPr>
         <w:t xml:space="preserve">Choosing a language (addition to Appendix B): click the language button at the top right of any page or of the login page (top left when the page is in Arabic), then pick English, ChiShona or Arabic from the list. The choice stays in place until you change it again.</w:t>
+      </w:r>
+    </w:p>
+    <w:p>
+      <w:pPr>
+        <w:spacing w:after="180" w:line="276"/>
+        <w:jc w:val="both"/>
+      </w:pPr>
+      <w:r>
+        <w:rPr>
+          <w:color w:val="1E293B"/>
+          <w:sz w:val="21"/>
+          <w:szCs w:val="21"/>
+        </w:rPr>
+        <w:t>Managing users (addition to Appendix B): the administrator (admin@rentalpro.com in the demo data) chooses Manage Users in the top bar to see every account with its role and status. To change a role, or to deactivate an account so it can no longer sign in, change the Role or untick Active on that row and choose Save; the change is recorded in the audit log and the user is emailed. + Add Staff creates a Maintenance Staff account and emails the new staff member a link to set a password. The system refuses any change that would leave no active Property Owner.</w:t>
       </w:r>
     </w:p>
     <w:p>
@@ -32377,6 +35307,10 @@
     <w:basedOn w:val="Normal"/>
     <w:next w:val="Normal"/>
     <w:qFormat/>
+    <w:pPr>
+      <w:keepNext/>
+      <w:outlineLvl w:val="0"/>
+    </w:pPr>
     <w:rPr>
       <w:color w:val="2E74B5"/>
       <w:sz w:val="32"/>
@@ -32388,6 +35322,10 @@
     <w:basedOn w:val="Normal"/>
     <w:next w:val="Normal"/>
     <w:qFormat/>
+    <w:pPr>
+      <w:keepNext/>
+      <w:outlineLvl w:val="1"/>
+    </w:pPr>
     <w:rPr>
       <w:color w:val="2E74B5"/>
       <w:sz w:val="26"/>
@@ -32399,6 +35337,10 @@
     <w:basedOn w:val="Normal"/>
     <w:next w:val="Normal"/>
     <w:qFormat/>
+    <w:pPr>
+      <w:keepNext/>
+      <w:outlineLvl w:val="2"/>
+    </w:pPr>
     <w:rPr>
       <w:color w:val="1F4D78"/>
       <w:sz w:val="24"/>
@@ -32410,6 +35352,10 @@
     <w:basedOn w:val="Normal"/>
     <w:next w:val="Normal"/>
     <w:qFormat/>
+    <w:pPr>
+      <w:keepNext/>
+      <w:outlineLvl w:val="3"/>
+    </w:pPr>
     <w:rPr>
       <w:i/>
       <w:iCs/>
@@ -32421,6 +35367,10 @@
     <w:basedOn w:val="Normal"/>
     <w:next w:val="Normal"/>
     <w:qFormat/>
+    <w:pPr>
+      <w:keepNext/>
+      <w:outlineLvl w:val="4"/>
+    </w:pPr>
     <w:rPr>
       <w:color w:val="2E74B5"/>
     </w:rPr>
@@ -32430,6 +35380,10 @@
     <w:basedOn w:val="Normal"/>
     <w:next w:val="Normal"/>
     <w:qFormat/>
+    <w:pPr>
+      <w:keepNext/>
+      <w:outlineLvl w:val="5"/>
+    </w:pPr>
     <w:rPr>
       <w:color w:val="1F4D78"/>
     </w:rPr>

</xml_diff>